<commit_message>
Updated realistic validation matrix
</commit_message>
<xml_diff>
--- a/FINAL_Report_GGV_WasteAI_60pages.docx
+++ b/FINAL_Report_GGV_WasteAI_60pages.docx
@@ -6759,39 +6759,39 @@
         <w:br/>
         <w:t xml:space="preserve">    model, base_model = build_model(num_classes, augmentation)</w:t>
         <w:br/>
+        <w:t xml:space="preserve">    #print(model.summary())</w:t>
+        <w:br/>
         <w:t xml:space="preserve">    lr_reduction = ReduceLROnPlateau(monitor='val_loss', patience=5, verbose=1, factor=0.3, min_lr=1e-07)</w:t>
         <w:br/>
         <w:t xml:space="preserve">    early_stop = EarlyStopping(monitor='val_loss', patience=7, restore_best_weights=True, verbose=1)</w:t>
         <w:br/>
+        <w:t xml:space="preserve">    checkpoint = ModelCheckpoint('best_weights.h5', monitor='val_accuracy', save_best_only=True, verbose=1, save_weights_only=True)</w:t>
+        <w:br/>
+        <w:t xml:space="preserve">    history_phase1 = model.fit(train_ds, epochs=EPOCHS_PHASE1, validation_data=val_ds, callbacks=[lr_reduction, checkpoint])</w:t>
+        <w:br/>
         <w:t xml:space="preserve">    </w:t>
         <w:br/>
-        <w:t xml:space="preserve">    # Checkpoint to auto-save the best model weights during training to avoid JSON serialization bug</w:t>
-        <w:br/>
-        <w:t xml:space="preserve">    checkpoint = ModelCheckpoint('best_weights.h5', monitor='val_accuracy', save_best_only=True, verbose=1, save_weights_only=True)</w:t>
+        <w:t xml:space="preserve">    model = prepare_for_fine_tuning(model, base_model)</w:t>
+        <w:br/>
+        <w:t xml:space="preserve">    history_phase2 = model.fit(train_ds, epochs=EPOCHS_PHASE1 + EPOCHS_PHASE2, initial_epoch=history_phase1.epoch[-1] + 1, validation_data=val_ds, callbacks=[lr_reduction, early_stop, checkpoint])</w:t>
+        <w:br/>
+        <w:t xml:space="preserve">    try:</w:t>
+        <w:br/>
+        <w:t xml:space="preserve">        model.load_weights('best_weights.h5')</w:t>
+        <w:br/>
+        <w:t xml:space="preserve">        print("Restored best weights from checkpoint.")</w:t>
+        <w:br/>
+        <w:t xml:space="preserve">    except:</w:t>
+        <w:br/>
+        <w:t xml:space="preserve">        pass</w:t>
+        <w:br/>
+        <w:t xml:space="preserve">    model.save(MODEL_SAVE_PATH, save_format='tf')</w:t>
         <w:br/>
         <w:t xml:space="preserve">    </w:t>
         <w:br/>
-        <w:t xml:space="preserve">    # Phase 1: No EarlyStopping — poore 15 epochs chalenge guaranteed</w:t>
-        <w:br/>
-        <w:t xml:space="preserve">    history_phase1 = model.fit(train_ds, epochs=EPOCHS_PHASE1, validation_data=val_ds, callbacks=[lr_reduction, checkpoint])</w:t>
-        <w:br/>
-        <w:t xml:space="preserve">    </w:t>
-        <w:br/>
-        <w:t xml:space="preserve">    model = prepare_for_fine_tuning(model, base_model)</w:t>
-        <w:br/>
-        <w:t xml:space="preserve">    # Phase 2: EarlyStopping chalega — but 15 ke baad</w:t>
-        <w:br/>
-        <w:t xml:space="preserve">    history_phase2 = model.fit(train_ds, epochs=EPOCHS_PHASE1 + EPOCHS_PHASE2, initial_epoch=history_phase1.epoch[-1] + 1, validation_data=val_ds, callbacks=[lr_reduction, early_stop, checkpoint])</w:t>
-        <w:br/>
-        <w:t xml:space="preserve">    </w:t>
-        <w:br/>
-        <w:t xml:space="preserve">    # Load the best weights we saved during training</w:t>
-        <w:br/>
         <w:t xml:space="preserve">    try:</w:t>
         <w:br/>
-        <w:t xml:space="preserve">        model.load_weights('best_weights.h5')</w:t>
-        <w:br/>
-        <w:t xml:space="preserve">        print("Restored best weights from checkpoint.")</w:t>
+        <w:t xml:space="preserve">        plot_history(history_phase1, history_phase2, len(history_phase1.epoch))</w:t>
         <w:br/>
         <w:t xml:space="preserve">    except:</w:t>
         <w:br/>
@@ -6799,22 +6799,6 @@
         <w:br/>
         <w:t xml:space="preserve">        </w:t>
         <w:br/>
-        <w:t xml:space="preserve">    # Save the architecture + best weights without JSON bug using TF format</w:t>
-        <w:br/>
-        <w:t xml:space="preserve">    model.save(MODEL_SAVE_PATH, save_format='tf')</w:t>
-        <w:br/>
-        <w:t xml:space="preserve">    </w:t>
-        <w:br/>
-        <w:t xml:space="preserve">    try:</w:t>
-        <w:br/>
-        <w:t xml:space="preserve">        plot_history(history_phase1, history_phase2, len(history_phase1.epoch))</w:t>
-        <w:br/>
-        <w:t xml:space="preserve">    except:</w:t>
-        <w:br/>
-        <w:t xml:space="preserve">        pass</w:t>
-        <w:br/>
-        <w:t xml:space="preserve">        </w:t>
-        <w:br/>
         <w:t xml:space="preserve">    evaluate_and_report(val_ds, class_names)</w:t>
         <w:br/>
         <w:br/>
@@ -6822,6 +6806,7 @@
         <w:br/>
         <w:t xml:space="preserve">    main()</w:t>
         <w:br/>
+        <w:t>#print(model.summary())</w:t>
       </w:r>
     </w:p>
     <w:p>
@@ -6959,9 +6944,6 @@
         <w:br/>
         <w:t xml:space="preserve">    print(report)</w:t>
         <w:br/>
-        <w:br/>
-        <w:t xml:space="preserve">    # Confusion Matrix (Validation Matrix)</w:t>
-        <w:br/>
         <w:t xml:space="preserve">    cm = confusion_matrix(y_true, y_pred)</w:t>
         <w:br/>
         <w:t xml:space="preserve">    plt.figure(figsize=(8, 6))</w:t>
@@ -7080,20 +7062,12 @@
         <w:br/>
         <w:t xml:space="preserve">            from AI_Training_Source_Code.data_loader import get_augmentation_layer</w:t>
         <w:br/>
-        <w:t xml:space="preserve">            </w:t>
-        <w:br/>
-        <w:t xml:space="preserve">            # Rebuild the identical architecture from training</w:t>
-        <w:br/>
         <w:t xml:space="preserve">            augmentation = get_augmentation_layer()</w:t>
         <w:br/>
         <w:t xml:space="preserve">            base, _ = build_model(len(CLASS_NAMES), augmentation)</w:t>
         <w:br/>
         <w:t xml:space="preserve">            model = prepare_for_fine_tuning(base, _)</w:t>
         <w:br/>
-        <w:t xml:space="preserve">            </w:t>
-        <w:br/>
-        <w:t xml:space="preserve">            # Load the safely saved best weights!</w:t>
-        <w:br/>
         <w:t xml:space="preserve">            model.load_weights(MODEL_WEIGHTS_PATH)</w:t>
         <w:br/>
         <w:t xml:space="preserve">            print("Successfully loaded model from best weights!")</w:t>
@@ -7148,19 +7122,15 @@
         <w:br/>
         <w:t xml:space="preserve">        img_array = np.array(img, dtype=np.float32)</w:t>
         <w:br/>
+        <w:t xml:space="preserve">        img_array = np.expand_dims(img_array, axis=0)</w:t>
+        <w:br/>
+        <w:br/>
+        <w:t xml:space="preserve">        predictions = current_model.predict(img_array, verbose=0)</w:t>
+        <w:br/>
+        <w:t xml:space="preserve">        score = predictions[0]</w:t>
+        <w:br/>
         <w:t xml:space="preserve">        </w:t>
         <w:br/>
-        <w:t xml:space="preserve">        # img_array = preprocess_input(img_array)  &lt;-- Hata diya kyuki model.py mein model ke andar already baked-in hai</w:t>
-        <w:br/>
-        <w:t xml:space="preserve">        img_array = np.expand_dims(img_array, axis=0)</w:t>
-        <w:br/>
-        <w:br/>
-        <w:t xml:space="preserve">        predictions = current_model.predict(img_array, verbose=0)</w:t>
-        <w:br/>
-        <w:t xml:space="preserve">        score = predictions[0]</w:t>
-        <w:br/>
-        <w:t xml:space="preserve">        </w:t>
-        <w:br/>
         <w:t xml:space="preserve">        result = {</w:t>
         <w:br/>
         <w:t xml:space="preserve">            'predictions': {</w:t>
@@ -7187,6 +7157,7 @@
         <w:t xml:space="preserve">    port = int(os.environ.get('PORT', 7860))</w:t>
         <w:br/>
         <w:t xml:space="preserve">    app.run(host='0.0.0.0', port=port, debug=False)</w:t>
+        <w:br/>
       </w:r>
     </w:p>
     <w:p>
@@ -16335,42 +16306,17 @@
         <w:br/>
         <w:t>cd "mini project final/"</w:t>
         <w:br/>
-        <w:br/>
-        <w:t># 2. Create and activate Python virtual environment</w:t>
-        <w:br/>
         <w:t>python3 -m venv venv</w:t>
         <w:br/>
         <w:t>source venv/bin/activate           # macOS/Linux</w:t>
         <w:br/>
-        <w:t># venv\Scripts\activate.bat      # Windows</w:t>
-        <w:br/>
-        <w:br/>
-        <w:t># 3. Install all dependencies</w:t>
-        <w:br/>
         <w:t>pip install -r requirements.txt</w:t>
         <w:br/>
-        <w:br/>
-        <w:t># 4. Train the model (if best_weights.h5 not present)</w:t>
-        <w:br/>
         <w:t>python AI_Training_Source_Code/train.py</w:t>
         <w:br/>
-        <w:br/>
-        <w:t># 5. Generate evaluation metrics and graphs</w:t>
-        <w:br/>
         <w:t>python recover.py</w:t>
         <w:br/>
-        <w:br/>
-        <w:t># 6. Launch the Flask web application</w:t>
-        <w:br/>
         <w:t>python app.py</w:t>
-        <w:br/>
-        <w:br/>
-        <w:t># 7. Open browser and navigate to:</w:t>
-        <w:br/>
-        <w:t>#    http://127.0.0.1:7860</w:t>
-        <w:br/>
-        <w:br/>
-        <w:t># requirements.txt contents:</w:t>
         <w:br/>
         <w:t>tensorflow==2.12.0</w:t>
         <w:br/>
@@ -16461,34 +16407,6 @@
     </w:p>
     <w:p>
       <w:pPr>
-        <w:pStyle w:val="Heading1"/>
-        <w:spacing w:before="280" w:after="160"/>
-      </w:pPr>
-      <w:r>
-        <w:rPr>
-          <w:rFonts w:ascii="Arial" w:hAnsi="Arial"/>
-          <w:b/>
-          <w:color w:val="00467F"/>
-          <w:sz w:val="32"/>
-        </w:rPr>
-        <w:t>CHAPTER 9-A: DETAILED SAME-DATASET COMPARATIVE ANALYSIS</w:t>
-      </w:r>
-    </w:p>
-    <w:p>
-      <w:pPr>
-        <w:spacing w:after="200" w:before="80"/>
-      </w:pPr>
-      <w:r>
-        <w:rPr>
-          <w:rFonts w:ascii="Times New Roman" w:hAnsi="Times New Roman"/>
-          <w:b w:val="0"/>
-          <w:sz w:val="24"/>
-        </w:rPr>
-        <w:t>A rigorous comparative analysis is essential to objectively position any research contribution within the broader academic landscape. This chapter presents four layers of comparison: (1) a direct same-dataset performance comparison with researchers who used the identical Garbage Classification V2 dataset; (2) training methodology comparison; (3) deployment features comparison; and (4) a per-class metric deep dive. Together, these tables demonstrate that the proposed EfficientNetB0-based system represents a significant advancement over all prior work on this specific dataset.</w:t>
-      </w:r>
-    </w:p>
-    <w:p>
-      <w:pPr>
         <w:pStyle w:val="Heading2"/>
         <w:spacing w:before="280" w:after="160"/>
       </w:pPr>
@@ -16499,4275 +16417,64 @@
           <w:color w:val="1F497D"/>
           <w:sz w:val="26"/>
         </w:rPr>
-        <w:t>9-A.1  Same-Dataset Performance Comparison (Garbage Classif. V2)</w:t>
-      </w:r>
-    </w:p>
-    <w:p>
-      <w:pPr>
-        <w:spacing w:after="200" w:before="80"/>
-      </w:pPr>
-      <w:r>
-        <w:rPr>
-          <w:rFonts w:ascii="Times New Roman" w:hAnsi="Times New Roman"/>
-          <w:b w:val="0"/>
-          <w:sz w:val="24"/>
-        </w:rPr>
-        <w:t>The most scientifically valid comparison is between systems trained on the SAME dataset. The table below compiles published and reproduced results from researchers who explicitly used the Garbage Classification V2 (sumn2u, Kaggle) dataset. This controlled comparison isolates the effect of architecture and training methodology, eliminating data distribution as a confounding variable:</w:t>
-      </w:r>
-    </w:p>
-    <w:tbl>
-      <w:tblPr>
-        <w:tblStyle w:val="TableGrid"/>
-        <w:tblW w:type="auto" w:w="0"/>
-        <w:tblLook w:firstColumn="1" w:firstRow="1" w:lastColumn="0" w:lastRow="0" w:noHBand="0" w:noVBand="1" w:val="04A0"/>
-      </w:tblPr>
-      <w:tblGrid>
-        <w:gridCol w:w="1176"/>
-        <w:gridCol w:w="1176"/>
-        <w:gridCol w:w="1176"/>
-        <w:gridCol w:w="1176"/>
-        <w:gridCol w:w="1176"/>
-        <w:gridCol w:w="1176"/>
-        <w:gridCol w:w="1176"/>
-        <w:gridCol w:w="1176"/>
-      </w:tblGrid>
-      <w:tr>
-        <w:tc>
-          <w:tcPr>
-            <w:tcW w:type="dxa" w:w="1176"/>
-          </w:tcPr>
-          <w:p>
-            <w:pPr>
-              <w:jc w:val="center"/>
-            </w:pPr>
-            <w:r>
-              <w:rPr>
-                <w:rFonts w:ascii="Arial" w:hAnsi="Arial"/>
-                <w:b/>
-                <w:sz w:val="18"/>
-              </w:rPr>
-              <w:t>Study / Team</w:t>
-            </w:r>
-          </w:p>
-        </w:tc>
-        <w:tc>
-          <w:tcPr>
-            <w:tcW w:type="dxa" w:w="1176"/>
-          </w:tcPr>
-          <w:p>
-            <w:pPr>
-              <w:jc w:val="center"/>
-            </w:pPr>
-            <w:r>
-              <w:rPr>
-                <w:rFonts w:ascii="Arial" w:hAnsi="Arial"/>
-                <w:b/>
-                <w:sz w:val="18"/>
-              </w:rPr>
-              <w:t>Year</w:t>
-            </w:r>
-          </w:p>
-        </w:tc>
-        <w:tc>
-          <w:tcPr>
-            <w:tcW w:type="dxa" w:w="1176"/>
-          </w:tcPr>
-          <w:p>
-            <w:pPr>
-              <w:jc w:val="center"/>
-            </w:pPr>
-            <w:r>
-              <w:rPr>
-                <w:rFonts w:ascii="Arial" w:hAnsi="Arial"/>
-                <w:b/>
-                <w:sz w:val="18"/>
-              </w:rPr>
-              <w:t>Architecture</w:t>
-            </w:r>
-          </w:p>
-        </w:tc>
-        <w:tc>
-          <w:tcPr>
-            <w:tcW w:type="dxa" w:w="1176"/>
-          </w:tcPr>
-          <w:p>
-            <w:pPr>
-              <w:jc w:val="center"/>
-            </w:pPr>
-            <w:r>
-              <w:rPr>
-                <w:rFonts w:ascii="Arial" w:hAnsi="Arial"/>
-                <w:b/>
-                <w:sz w:val="18"/>
-              </w:rPr>
-              <w:t>Overall Acc.</w:t>
-            </w:r>
-          </w:p>
-        </w:tc>
-        <w:tc>
-          <w:tcPr>
-            <w:tcW w:type="dxa" w:w="1176"/>
-          </w:tcPr>
-          <w:p>
-            <w:pPr>
-              <w:jc w:val="center"/>
-            </w:pPr>
-            <w:r>
-              <w:rPr>
-                <w:rFonts w:ascii="Arial" w:hAnsi="Arial"/>
-                <w:b/>
-                <w:sz w:val="18"/>
-              </w:rPr>
-              <w:t>Metal F1</w:t>
-            </w:r>
-          </w:p>
-        </w:tc>
-        <w:tc>
-          <w:tcPr>
-            <w:tcW w:type="dxa" w:w="1176"/>
-          </w:tcPr>
-          <w:p>
-            <w:pPr>
-              <w:jc w:val="center"/>
-            </w:pPr>
-            <w:r>
-              <w:rPr>
-                <w:rFonts w:ascii="Arial" w:hAnsi="Arial"/>
-                <w:b/>
-                <w:sz w:val="18"/>
-              </w:rPr>
-              <w:t>Paper F1</w:t>
-            </w:r>
-          </w:p>
-        </w:tc>
-        <w:tc>
-          <w:tcPr>
-            <w:tcW w:type="dxa" w:w="1176"/>
-          </w:tcPr>
-          <w:p>
-            <w:pPr>
-              <w:jc w:val="center"/>
-            </w:pPr>
-            <w:r>
-              <w:rPr>
-                <w:rFonts w:ascii="Arial" w:hAnsi="Arial"/>
-                <w:b/>
-                <w:sz w:val="18"/>
-              </w:rPr>
-              <w:t>Plastic F1</w:t>
-            </w:r>
-          </w:p>
-        </w:tc>
-        <w:tc>
-          <w:tcPr>
-            <w:tcW w:type="dxa" w:w="1176"/>
-          </w:tcPr>
-          <w:p>
-            <w:pPr>
-              <w:jc w:val="center"/>
-            </w:pPr>
-            <w:r>
-              <w:rPr>
-                <w:rFonts w:ascii="Arial" w:hAnsi="Arial"/>
-                <w:b/>
-                <w:sz w:val="18"/>
-              </w:rPr>
-              <w:t>Aug. Used</w:t>
-            </w:r>
-          </w:p>
-        </w:tc>
-      </w:tr>
-      <w:tr>
-        <w:tc>
-          <w:tcPr>
-            <w:tcW w:type="dxa" w:w="1176"/>
-          </w:tcPr>
-          <w:p>
-            <w:r>
-              <w:rPr>
-                <w:rFonts w:ascii="Times New Roman" w:hAnsi="Times New Roman"/>
-                <w:sz w:val="18"/>
-              </w:rPr>
-              <w:t>Kaggle Baseline (sumn2u)</w:t>
-            </w:r>
-          </w:p>
-        </w:tc>
-        <w:tc>
-          <w:tcPr>
-            <w:tcW w:type="dxa" w:w="1176"/>
-          </w:tcPr>
-          <w:p>
-            <w:r>
-              <w:rPr>
-                <w:rFonts w:ascii="Times New Roman" w:hAnsi="Times New Roman"/>
-                <w:sz w:val="18"/>
-              </w:rPr>
-              <w:t>2022</w:t>
-            </w:r>
-          </w:p>
-        </w:tc>
-        <w:tc>
-          <w:tcPr>
-            <w:tcW w:type="dxa" w:w="1176"/>
-          </w:tcPr>
-          <w:p>
-            <w:r>
-              <w:rPr>
-                <w:rFonts w:ascii="Times New Roman" w:hAnsi="Times New Roman"/>
-                <w:sz w:val="18"/>
-              </w:rPr>
-              <w:t>Simple CNN (3 layers)</w:t>
-            </w:r>
-          </w:p>
-        </w:tc>
-        <w:tc>
-          <w:tcPr>
-            <w:tcW w:type="dxa" w:w="1176"/>
-          </w:tcPr>
-          <w:p>
-            <w:r>
-              <w:rPr>
-                <w:rFonts w:ascii="Times New Roman" w:hAnsi="Times New Roman"/>
-                <w:sz w:val="18"/>
-              </w:rPr>
-              <w:t>74.1%</w:t>
-            </w:r>
-          </w:p>
-        </w:tc>
-        <w:tc>
-          <w:tcPr>
-            <w:tcW w:type="dxa" w:w="1176"/>
-          </w:tcPr>
-          <w:p>
-            <w:r>
-              <w:rPr>
-                <w:rFonts w:ascii="Times New Roman" w:hAnsi="Times New Roman"/>
-                <w:sz w:val="18"/>
-              </w:rPr>
-              <w:t>0.70</w:t>
-            </w:r>
-          </w:p>
-        </w:tc>
-        <w:tc>
-          <w:tcPr>
-            <w:tcW w:type="dxa" w:w="1176"/>
-          </w:tcPr>
-          <w:p>
-            <w:r>
-              <w:rPr>
-                <w:rFonts w:ascii="Times New Roman" w:hAnsi="Times New Roman"/>
-                <w:sz w:val="18"/>
-              </w:rPr>
-              <w:t>0.76</w:t>
-            </w:r>
-          </w:p>
-        </w:tc>
-        <w:tc>
-          <w:tcPr>
-            <w:tcW w:type="dxa" w:w="1176"/>
-          </w:tcPr>
-          <w:p>
-            <w:r>
-              <w:rPr>
-                <w:rFonts w:ascii="Times New Roman" w:hAnsi="Times New Roman"/>
-                <w:sz w:val="18"/>
-              </w:rPr>
-              <w:t>0.73</w:t>
-            </w:r>
-          </w:p>
-        </w:tc>
-        <w:tc>
-          <w:tcPr>
-            <w:tcW w:type="dxa" w:w="1176"/>
-          </w:tcPr>
-          <w:p>
-            <w:r>
-              <w:rPr>
-                <w:rFonts w:ascii="Times New Roman" w:hAnsi="Times New Roman"/>
-                <w:sz w:val="18"/>
-              </w:rPr>
-              <w:t>None</w:t>
-            </w:r>
-          </w:p>
-        </w:tc>
-      </w:tr>
-      <w:tr>
-        <w:tc>
-          <w:tcPr>
-            <w:tcW w:type="dxa" w:w="1176"/>
-          </w:tcPr>
-          <w:p>
-            <w:r>
-              <w:rPr>
-                <w:rFonts w:ascii="Times New Roman" w:hAnsi="Times New Roman"/>
-                <w:sz w:val="18"/>
-              </w:rPr>
-              <w:t>Thakur &amp; Sharma</w:t>
-            </w:r>
-          </w:p>
-        </w:tc>
-        <w:tc>
-          <w:tcPr>
-            <w:tcW w:type="dxa" w:w="1176"/>
-          </w:tcPr>
-          <w:p>
-            <w:r>
-              <w:rPr>
-                <w:rFonts w:ascii="Times New Roman" w:hAnsi="Times New Roman"/>
-                <w:sz w:val="18"/>
-              </w:rPr>
-              <w:t>2022</w:t>
-            </w:r>
-          </w:p>
-        </w:tc>
-        <w:tc>
-          <w:tcPr>
-            <w:tcW w:type="dxa" w:w="1176"/>
-          </w:tcPr>
-          <w:p>
-            <w:r>
-              <w:rPr>
-                <w:rFonts w:ascii="Times New Roman" w:hAnsi="Times New Roman"/>
-                <w:sz w:val="18"/>
-              </w:rPr>
-              <w:t>VGG-16 Fine-tuned</w:t>
-            </w:r>
-          </w:p>
-        </w:tc>
-        <w:tc>
-          <w:tcPr>
-            <w:tcW w:type="dxa" w:w="1176"/>
-          </w:tcPr>
-          <w:p>
-            <w:r>
-              <w:rPr>
-                <w:rFonts w:ascii="Times New Roman" w:hAnsi="Times New Roman"/>
-                <w:sz w:val="18"/>
-              </w:rPr>
-              <w:t>88.3%</w:t>
-            </w:r>
-          </w:p>
-        </w:tc>
-        <w:tc>
-          <w:tcPr>
-            <w:tcW w:type="dxa" w:w="1176"/>
-          </w:tcPr>
-          <w:p>
-            <w:r>
-              <w:rPr>
-                <w:rFonts w:ascii="Times New Roman" w:hAnsi="Times New Roman"/>
-                <w:sz w:val="18"/>
-              </w:rPr>
-              <w:t>0.84</w:t>
-            </w:r>
-          </w:p>
-        </w:tc>
-        <w:tc>
-          <w:tcPr>
-            <w:tcW w:type="dxa" w:w="1176"/>
-          </w:tcPr>
-          <w:p>
-            <w:r>
-              <w:rPr>
-                <w:rFonts w:ascii="Times New Roman" w:hAnsi="Times New Roman"/>
-                <w:sz w:val="18"/>
-              </w:rPr>
-              <w:t>0.90</w:t>
-            </w:r>
-          </w:p>
-        </w:tc>
-        <w:tc>
-          <w:tcPr>
-            <w:tcW w:type="dxa" w:w="1176"/>
-          </w:tcPr>
-          <w:p>
-            <w:r>
-              <w:rPr>
-                <w:rFonts w:ascii="Times New Roman" w:hAnsi="Times New Roman"/>
-                <w:sz w:val="18"/>
-              </w:rPr>
-              <w:t>0.87</w:t>
-            </w:r>
-          </w:p>
-        </w:tc>
-        <w:tc>
-          <w:tcPr>
-            <w:tcW w:type="dxa" w:w="1176"/>
-          </w:tcPr>
-          <w:p>
-            <w:r>
-              <w:rPr>
-                <w:rFonts w:ascii="Times New Roman" w:hAnsi="Times New Roman"/>
-                <w:sz w:val="18"/>
-              </w:rPr>
-              <w:t>Flip, Brightness</w:t>
-            </w:r>
-          </w:p>
-        </w:tc>
-      </w:tr>
-      <w:tr>
-        <w:tc>
-          <w:tcPr>
-            <w:tcW w:type="dxa" w:w="1176"/>
-          </w:tcPr>
-          <w:p>
-            <w:r>
-              <w:rPr>
-                <w:rFonts w:ascii="Times New Roman" w:hAnsi="Times New Roman"/>
-                <w:sz w:val="18"/>
-              </w:rPr>
-              <w:t>Zhang et al.</w:t>
-            </w:r>
-          </w:p>
-        </w:tc>
-        <w:tc>
-          <w:tcPr>
-            <w:tcW w:type="dxa" w:w="1176"/>
-          </w:tcPr>
-          <w:p>
-            <w:r>
-              <w:rPr>
-                <w:rFonts w:ascii="Times New Roman" w:hAnsi="Times New Roman"/>
-                <w:sz w:val="18"/>
-              </w:rPr>
-              <w:t>2023</w:t>
-            </w:r>
-          </w:p>
-        </w:tc>
-        <w:tc>
-          <w:tcPr>
-            <w:tcW w:type="dxa" w:w="1176"/>
-          </w:tcPr>
-          <w:p>
-            <w:r>
-              <w:rPr>
-                <w:rFonts w:ascii="Times New Roman" w:hAnsi="Times New Roman"/>
-                <w:sz w:val="18"/>
-              </w:rPr>
-              <w:t>ResNet-50 Transfer Learn.</w:t>
-            </w:r>
-          </w:p>
-        </w:tc>
-        <w:tc>
-          <w:tcPr>
-            <w:tcW w:type="dxa" w:w="1176"/>
-          </w:tcPr>
-          <w:p>
-            <w:r>
-              <w:rPr>
-                <w:rFonts w:ascii="Times New Roman" w:hAnsi="Times New Roman"/>
-                <w:sz w:val="18"/>
-              </w:rPr>
-              <w:t>91.5%</w:t>
-            </w:r>
-          </w:p>
-        </w:tc>
-        <w:tc>
-          <w:tcPr>
-            <w:tcW w:type="dxa" w:w="1176"/>
-          </w:tcPr>
-          <w:p>
-            <w:r>
-              <w:rPr>
-                <w:rFonts w:ascii="Times New Roman" w:hAnsi="Times New Roman"/>
-                <w:sz w:val="18"/>
-              </w:rPr>
-              <w:t>0.89</w:t>
-            </w:r>
-          </w:p>
-        </w:tc>
-        <w:tc>
-          <w:tcPr>
-            <w:tcW w:type="dxa" w:w="1176"/>
-          </w:tcPr>
-          <w:p>
-            <w:r>
-              <w:rPr>
-                <w:rFonts w:ascii="Times New Roman" w:hAnsi="Times New Roman"/>
-                <w:sz w:val="18"/>
-              </w:rPr>
-              <w:t>0.93</w:t>
-            </w:r>
-          </w:p>
-        </w:tc>
-        <w:tc>
-          <w:tcPr>
-            <w:tcW w:type="dxa" w:w="1176"/>
-          </w:tcPr>
-          <w:p>
-            <w:r>
-              <w:rPr>
-                <w:rFonts w:ascii="Times New Roman" w:hAnsi="Times New Roman"/>
-                <w:sz w:val="18"/>
-              </w:rPr>
-              <w:t>0.91</w:t>
-            </w:r>
-          </w:p>
-        </w:tc>
-        <w:tc>
-          <w:tcPr>
-            <w:tcW w:type="dxa" w:w="1176"/>
-          </w:tcPr>
-          <w:p>
-            <w:r>
-              <w:rPr>
-                <w:rFonts w:ascii="Times New Roman" w:hAnsi="Times New Roman"/>
-                <w:sz w:val="18"/>
-              </w:rPr>
-              <w:t>Flip, Rotation, Crop</w:t>
-            </w:r>
-          </w:p>
-        </w:tc>
-      </w:tr>
-      <w:tr>
-        <w:tc>
-          <w:tcPr>
-            <w:tcW w:type="dxa" w:w="1176"/>
-          </w:tcPr>
-          <w:p>
-            <w:r>
-              <w:rPr>
-                <w:rFonts w:ascii="Times New Roman" w:hAnsi="Times New Roman"/>
-                <w:sz w:val="18"/>
-              </w:rPr>
-              <w:t>Nowakowski et al.</w:t>
-            </w:r>
-          </w:p>
-        </w:tc>
-        <w:tc>
-          <w:tcPr>
-            <w:tcW w:type="dxa" w:w="1176"/>
-          </w:tcPr>
-          <w:p>
-            <w:r>
-              <w:rPr>
-                <w:rFonts w:ascii="Times New Roman" w:hAnsi="Times New Roman"/>
-                <w:sz w:val="18"/>
-              </w:rPr>
-              <w:t>2020</w:t>
-            </w:r>
-          </w:p>
-        </w:tc>
-        <w:tc>
-          <w:tcPr>
-            <w:tcW w:type="dxa" w:w="1176"/>
-          </w:tcPr>
-          <w:p>
-            <w:r>
-              <w:rPr>
-                <w:rFonts w:ascii="Times New Roman" w:hAnsi="Times New Roman"/>
-                <w:sz w:val="18"/>
-              </w:rPr>
-              <w:t>MobileNetV2</w:t>
-            </w:r>
-          </w:p>
-        </w:tc>
-        <w:tc>
-          <w:tcPr>
-            <w:tcW w:type="dxa" w:w="1176"/>
-          </w:tcPr>
-          <w:p>
-            <w:r>
-              <w:rPr>
-                <w:rFonts w:ascii="Times New Roman" w:hAnsi="Times New Roman"/>
-                <w:sz w:val="18"/>
-              </w:rPr>
-              <w:t>94.0%</w:t>
-            </w:r>
-          </w:p>
-        </w:tc>
-        <w:tc>
-          <w:tcPr>
-            <w:tcW w:type="dxa" w:w="1176"/>
-          </w:tcPr>
-          <w:p>
-            <w:r>
-              <w:rPr>
-                <w:rFonts w:ascii="Times New Roman" w:hAnsi="Times New Roman"/>
-                <w:sz w:val="18"/>
-              </w:rPr>
-              <w:t>0.92</w:t>
-            </w:r>
-          </w:p>
-        </w:tc>
-        <w:tc>
-          <w:tcPr>
-            <w:tcW w:type="dxa" w:w="1176"/>
-          </w:tcPr>
-          <w:p>
-            <w:r>
-              <w:rPr>
-                <w:rFonts w:ascii="Times New Roman" w:hAnsi="Times New Roman"/>
-                <w:sz w:val="18"/>
-              </w:rPr>
-              <w:t>0.95</w:t>
-            </w:r>
-          </w:p>
-        </w:tc>
-        <w:tc>
-          <w:tcPr>
-            <w:tcW w:type="dxa" w:w="1176"/>
-          </w:tcPr>
-          <w:p>
-            <w:r>
-              <w:rPr>
-                <w:rFonts w:ascii="Times New Roman" w:hAnsi="Times New Roman"/>
-                <w:sz w:val="18"/>
-              </w:rPr>
-              <w:t>0.93</w:t>
-            </w:r>
-          </w:p>
-        </w:tc>
-        <w:tc>
-          <w:tcPr>
-            <w:tcW w:type="dxa" w:w="1176"/>
-          </w:tcPr>
-          <w:p>
-            <w:r>
-              <w:rPr>
-                <w:rFonts w:ascii="Times New Roman" w:hAnsi="Times New Roman"/>
-                <w:sz w:val="18"/>
-              </w:rPr>
-              <w:t>Flip, Zoom, Rotate</w:t>
-            </w:r>
-          </w:p>
-        </w:tc>
-      </w:tr>
-      <w:tr>
-        <w:tc>
-          <w:tcPr>
-            <w:tcW w:type="dxa" w:w="1176"/>
-          </w:tcPr>
-          <w:p>
-            <w:r>
-              <w:rPr>
-                <w:rFonts w:ascii="Times New Roman" w:hAnsi="Times New Roman"/>
-                <w:sz w:val="18"/>
-              </w:rPr>
-              <w:t>Mishra &amp; Gupta</w:t>
-            </w:r>
-          </w:p>
-        </w:tc>
-        <w:tc>
-          <w:tcPr>
-            <w:tcW w:type="dxa" w:w="1176"/>
-          </w:tcPr>
-          <w:p>
-            <w:r>
-              <w:rPr>
-                <w:rFonts w:ascii="Times New Roman" w:hAnsi="Times New Roman"/>
-                <w:sz w:val="18"/>
-              </w:rPr>
-              <w:t>2023</w:t>
-            </w:r>
-          </w:p>
-        </w:tc>
-        <w:tc>
-          <w:tcPr>
-            <w:tcW w:type="dxa" w:w="1176"/>
-          </w:tcPr>
-          <w:p>
-            <w:r>
-              <w:rPr>
-                <w:rFonts w:ascii="Times New Roman" w:hAnsi="Times New Roman"/>
-                <w:sz w:val="18"/>
-              </w:rPr>
-              <w:t>DenseNet-121</w:t>
-            </w:r>
-          </w:p>
-        </w:tc>
-        <w:tc>
-          <w:tcPr>
-            <w:tcW w:type="dxa" w:w="1176"/>
-          </w:tcPr>
-          <w:p>
-            <w:r>
-              <w:rPr>
-                <w:rFonts w:ascii="Times New Roman" w:hAnsi="Times New Roman"/>
-                <w:sz w:val="18"/>
-              </w:rPr>
-              <w:t>93.8%</w:t>
-            </w:r>
-          </w:p>
-        </w:tc>
-        <w:tc>
-          <w:tcPr>
-            <w:tcW w:type="dxa" w:w="1176"/>
-          </w:tcPr>
-          <w:p>
-            <w:r>
-              <w:rPr>
-                <w:rFonts w:ascii="Times New Roman" w:hAnsi="Times New Roman"/>
-                <w:sz w:val="18"/>
-              </w:rPr>
-              <w:t>0.91</w:t>
-            </w:r>
-          </w:p>
-        </w:tc>
-        <w:tc>
-          <w:tcPr>
-            <w:tcW w:type="dxa" w:w="1176"/>
-          </w:tcPr>
-          <w:p>
-            <w:r>
-              <w:rPr>
-                <w:rFonts w:ascii="Times New Roman" w:hAnsi="Times New Roman"/>
-                <w:sz w:val="18"/>
-              </w:rPr>
-              <w:t>0.95</w:t>
-            </w:r>
-          </w:p>
-        </w:tc>
-        <w:tc>
-          <w:tcPr>
-            <w:tcW w:type="dxa" w:w="1176"/>
-          </w:tcPr>
-          <w:p>
-            <w:r>
-              <w:rPr>
-                <w:rFonts w:ascii="Times New Roman" w:hAnsi="Times New Roman"/>
-                <w:sz w:val="18"/>
-              </w:rPr>
-              <w:t>0.93</w:t>
-            </w:r>
-          </w:p>
-        </w:tc>
-        <w:tc>
-          <w:tcPr>
-            <w:tcW w:type="dxa" w:w="1176"/>
-          </w:tcPr>
-          <w:p>
-            <w:r>
-              <w:rPr>
-                <w:rFonts w:ascii="Times New Roman" w:hAnsi="Times New Roman"/>
-                <w:sz w:val="18"/>
-              </w:rPr>
-              <w:t>Flip, Color Jitter</w:t>
-            </w:r>
-          </w:p>
-        </w:tc>
-      </w:tr>
-      <w:tr>
-        <w:tc>
-          <w:tcPr>
-            <w:tcW w:type="dxa" w:w="1176"/>
-          </w:tcPr>
-          <w:p>
-            <w:r>
-              <w:rPr>
-                <w:rFonts w:ascii="Times New Roman" w:hAnsi="Times New Roman"/>
-                <w:sz w:val="18"/>
-              </w:rPr>
-              <w:t>Patel et al.</w:t>
-            </w:r>
-          </w:p>
-        </w:tc>
-        <w:tc>
-          <w:tcPr>
-            <w:tcW w:type="dxa" w:w="1176"/>
-          </w:tcPr>
-          <w:p>
-            <w:r>
-              <w:rPr>
-                <w:rFonts w:ascii="Times New Roman" w:hAnsi="Times New Roman"/>
-                <w:sz w:val="18"/>
-              </w:rPr>
-              <w:t>2023</w:t>
-            </w:r>
-          </w:p>
-        </w:tc>
-        <w:tc>
-          <w:tcPr>
-            <w:tcW w:type="dxa" w:w="1176"/>
-          </w:tcPr>
-          <w:p>
-            <w:r>
-              <w:rPr>
-                <w:rFonts w:ascii="Times New Roman" w:hAnsi="Times New Roman"/>
-                <w:sz w:val="18"/>
-              </w:rPr>
-              <w:t>InceptionV3</w:t>
-            </w:r>
-          </w:p>
-        </w:tc>
-        <w:tc>
-          <w:tcPr>
-            <w:tcW w:type="dxa" w:w="1176"/>
-          </w:tcPr>
-          <w:p>
-            <w:r>
-              <w:rPr>
-                <w:rFonts w:ascii="Times New Roman" w:hAnsi="Times New Roman"/>
-                <w:sz w:val="18"/>
-              </w:rPr>
-              <w:t>92.6%</w:t>
-            </w:r>
-          </w:p>
-        </w:tc>
-        <w:tc>
-          <w:tcPr>
-            <w:tcW w:type="dxa" w:w="1176"/>
-          </w:tcPr>
-          <w:p>
-            <w:r>
-              <w:rPr>
-                <w:rFonts w:ascii="Times New Roman" w:hAnsi="Times New Roman"/>
-                <w:sz w:val="18"/>
-              </w:rPr>
-              <w:t>0.89</w:t>
-            </w:r>
-          </w:p>
-        </w:tc>
-        <w:tc>
-          <w:tcPr>
-            <w:tcW w:type="dxa" w:w="1176"/>
-          </w:tcPr>
-          <w:p>
-            <w:r>
-              <w:rPr>
-                <w:rFonts w:ascii="Times New Roman" w:hAnsi="Times New Roman"/>
-                <w:sz w:val="18"/>
-              </w:rPr>
-              <w:t>0.94</w:t>
-            </w:r>
-          </w:p>
-        </w:tc>
-        <w:tc>
-          <w:tcPr>
-            <w:tcW w:type="dxa" w:w="1176"/>
-          </w:tcPr>
-          <w:p>
-            <w:r>
-              <w:rPr>
-                <w:rFonts w:ascii="Times New Roman" w:hAnsi="Times New Roman"/>
-                <w:sz w:val="18"/>
-              </w:rPr>
-              <w:t>0.92</w:t>
-            </w:r>
-          </w:p>
-        </w:tc>
-        <w:tc>
-          <w:tcPr>
-            <w:tcW w:type="dxa" w:w="1176"/>
-          </w:tcPr>
-          <w:p>
-            <w:r>
-              <w:rPr>
-                <w:rFonts w:ascii="Times New Roman" w:hAnsi="Times New Roman"/>
-                <w:sz w:val="18"/>
-              </w:rPr>
-              <w:t>Flip, Rotation</w:t>
-            </w:r>
-          </w:p>
-        </w:tc>
-      </w:tr>
-      <w:tr>
-        <w:tc>
-          <w:tcPr>
-            <w:tcW w:type="dxa" w:w="1176"/>
-          </w:tcPr>
-          <w:p>
-            <w:r>
-              <w:rPr>
-                <w:rFonts w:ascii="Times New Roman" w:hAnsi="Times New Roman"/>
-                <w:sz w:val="18"/>
-              </w:rPr>
-              <w:t>THIS PROJECT (GGV 2024)</w:t>
-            </w:r>
-          </w:p>
-        </w:tc>
-        <w:tc>
-          <w:tcPr>
-            <w:tcW w:type="dxa" w:w="1176"/>
-          </w:tcPr>
-          <w:p>
-            <w:r>
-              <w:rPr>
-                <w:rFonts w:ascii="Times New Roman" w:hAnsi="Times New Roman"/>
-                <w:sz w:val="18"/>
-              </w:rPr>
-              <w:t>2024</w:t>
-            </w:r>
-          </w:p>
-        </w:tc>
-        <w:tc>
-          <w:tcPr>
-            <w:tcW w:type="dxa" w:w="1176"/>
-          </w:tcPr>
-          <w:p>
-            <w:r>
-              <w:rPr>
-                <w:rFonts w:ascii="Times New Roman" w:hAnsi="Times New Roman"/>
-                <w:sz w:val="18"/>
-              </w:rPr>
-              <w:t>EfficientNetB0 (2-Phase)</w:t>
-            </w:r>
-          </w:p>
-        </w:tc>
-        <w:tc>
-          <w:tcPr>
-            <w:tcW w:type="dxa" w:w="1176"/>
-          </w:tcPr>
-          <w:p>
-            <w:r>
-              <w:rPr>
-                <w:rFonts w:ascii="Times New Roman" w:hAnsi="Times New Roman"/>
-                <w:sz w:val="18"/>
-              </w:rPr>
-              <w:t>97.0% [BEST]</w:t>
-            </w:r>
-          </w:p>
-        </w:tc>
-        <w:tc>
-          <w:tcPr>
-            <w:tcW w:type="dxa" w:w="1176"/>
-          </w:tcPr>
-          <w:p>
-            <w:r>
-              <w:rPr>
-                <w:rFonts w:ascii="Times New Roman" w:hAnsi="Times New Roman"/>
-                <w:sz w:val="18"/>
-              </w:rPr>
-              <w:t>0.95 [BEST]</w:t>
-            </w:r>
-          </w:p>
-        </w:tc>
-        <w:tc>
-          <w:tcPr>
-            <w:tcW w:type="dxa" w:w="1176"/>
-          </w:tcPr>
-          <w:p>
-            <w:r>
-              <w:rPr>
-                <w:rFonts w:ascii="Times New Roman" w:hAnsi="Times New Roman"/>
-                <w:sz w:val="18"/>
-              </w:rPr>
-              <w:t>0.98 [BEST]</w:t>
-            </w:r>
-          </w:p>
-        </w:tc>
-        <w:tc>
-          <w:tcPr>
-            <w:tcW w:type="dxa" w:w="1176"/>
-          </w:tcPr>
-          <w:p>
-            <w:r>
-              <w:rPr>
-                <w:rFonts w:ascii="Times New Roman" w:hAnsi="Times New Roman"/>
-                <w:sz w:val="18"/>
-              </w:rPr>
-              <w:t>0.97 [BEST]</w:t>
-            </w:r>
-          </w:p>
-        </w:tc>
-        <w:tc>
-          <w:tcPr>
-            <w:tcW w:type="dxa" w:w="1176"/>
-          </w:tcPr>
-          <w:p>
-            <w:r>
-              <w:rPr>
-                <w:rFonts w:ascii="Times New Roman" w:hAnsi="Times New Roman"/>
-                <w:sz w:val="18"/>
-              </w:rPr>
-              <w:t>Flip+Rotate+Zoom</w:t>
-            </w:r>
-          </w:p>
-        </w:tc>
-      </w:tr>
-    </w:tbl>
-    <w:p>
-      <w:pPr>
-        <w:spacing w:before="80"/>
-        <w:jc w:val="center"/>
-      </w:pPr>
-      <w:r>
-        <w:rPr>
-          <w:i/>
-          <w:sz w:val="18"/>
-        </w:rPr>
-        <w:t>Table 9A.1: Direct Same-Dataset Comparison — Garbage Classif. V2 — Per-Class F1 Scores</w:t>
-      </w:r>
-    </w:p>
-    <w:p>
-      <w:pPr>
-        <w:spacing w:after="200" w:before="80"/>
-      </w:pPr>
-      <w:r>
-        <w:rPr>
-          <w:rFonts w:ascii="Times New Roman" w:hAnsi="Times New Roman"/>
-          <w:b w:val="0"/>
-          <w:sz w:val="24"/>
-        </w:rPr>
-        <w:t>Analysis of Table 9A.1 reveals that the proposed EfficientNetB0 system achieves the highest overall accuracy (97.0%) AND the best F1-score on every single class simultaneously — Metal (0.95), Paper (0.98), and Plastic (0.97). The margin over the previous best (MobileNetV2, 94.0%) is 3.0 percentage points. Gaining 3 full accuracy points at high accuracy levels (above 90%) is non-trivial — it requires architectural improvement, better training protocol, or both. In this case, both factors contribute: EfficientNetB0's compound-scaled architecture provides superior feature representations, and the Two-Phase fine-tuning protocol preserves ImageNet knowledge during domain adaptation.</w:t>
-      </w:r>
-    </w:p>
-    <w:p>
-      <w:pPr>
-        <w:spacing w:after="200" w:before="80"/>
-      </w:pPr>
-      <w:r>
-        <w:rPr>
-          <w:rFonts w:ascii="Times New Roman" w:hAnsi="Times New Roman"/>
-          <w:b w:val="0"/>
-          <w:sz w:val="24"/>
-        </w:rPr>
-        <w:t>The Metal class is systematically the hardest class across ALL competing systems — every team reports their lowest F1 for Metal (0.70 to 0.92). Our model achieves Metal F1 = 0.95, the highest Metal F1 on this dataset, likely due to EfficientNetB0's Squeeze-and-Excitation (SE) channel attention mechanism, which adaptively amplifies specular reflection and metallic-texture feature channels. This is a clear architectural advantage over MobileNetV2 and ResNet-50, which lack explicit channel attention modules.</w:t>
-      </w:r>
-    </w:p>
-    <w:p>
-      <w:pPr>
-        <w:spacing w:after="200" w:before="80"/>
-      </w:pPr>
-      <w:r>
-        <w:rPr>
-          <w:rFonts w:ascii="Times New Roman" w:hAnsi="Times New Roman"/>
-          <w:b w:val="0"/>
-          <w:sz w:val="24"/>
-        </w:rPr>
-        <w:t>It is also significant that the simple CNN baseline achieves only 74.1% — confirming that 3,863 images are wholly insufficient for high-accuracy CNN training from random initialization. The 22.9-point performance gap between the baseline and our system demonstrates the transformative power of Transfer Learning from 14-million-image ImageNet pre-training. Every system in the comparison employs some form of transfer learning, reinforcing this as the essential ingredient for waste classification AI at this dataset scale.</w:t>
-      </w:r>
-    </w:p>
-    <w:p>
-      <w:pPr>
-        <w:pStyle w:val="Heading2"/>
-        <w:spacing w:before="280" w:after="160"/>
-      </w:pPr>
-      <w:r>
-        <w:rPr>
-          <w:rFonts w:ascii="Arial" w:hAnsi="Arial"/>
-          <w:b/>
-          <w:color w:val="1F497D"/>
-          <w:sz w:val="26"/>
-        </w:rPr>
-        <w:t>9-A.2  Training Methodology Comparison</w:t>
-      </w:r>
-    </w:p>
-    <w:p>
-      <w:pPr>
-        <w:spacing w:after="200" w:before="80"/>
-      </w:pPr>
-      <w:r>
-        <w:rPr>
-          <w:rFonts w:ascii="Times New Roman" w:hAnsi="Times New Roman"/>
-          <w:b w:val="0"/>
-          <w:sz w:val="24"/>
-        </w:rPr>
-        <w:t>The following table compares the training pipeline strategies adopted by each research team, revealing key methodological differences that explain the performance hierarchy in Table 9A.1:</w:t>
-      </w:r>
-    </w:p>
-    <w:tbl>
-      <w:tblPr>
-        <w:tblStyle w:val="TableGrid"/>
-        <w:tblW w:type="auto" w:w="0"/>
-        <w:tblLook w:firstColumn="1" w:firstRow="1" w:lastColumn="0" w:lastRow="0" w:noHBand="0" w:noVBand="1" w:val="04A0"/>
-      </w:tblPr>
-      <w:tblGrid>
-        <w:gridCol w:w="1567"/>
-        <w:gridCol w:w="1567"/>
-        <w:gridCol w:w="1567"/>
-        <w:gridCol w:w="1567"/>
-        <w:gridCol w:w="1567"/>
-        <w:gridCol w:w="1567"/>
-      </w:tblGrid>
-      <w:tr>
-        <w:tc>
-          <w:tcPr>
-            <w:tcW w:type="dxa" w:w="1567"/>
-          </w:tcPr>
-          <w:p>
-            <w:pPr>
-              <w:jc w:val="center"/>
-            </w:pPr>
-            <w:r>
-              <w:rPr>
-                <w:rFonts w:ascii="Arial" w:hAnsi="Arial"/>
-                <w:b/>
-                <w:sz w:val="18"/>
-              </w:rPr>
-              <w:t>Team / System</w:t>
-            </w:r>
-          </w:p>
-        </w:tc>
-        <w:tc>
-          <w:tcPr>
-            <w:tcW w:type="dxa" w:w="1567"/>
-          </w:tcPr>
-          <w:p>
-            <w:pPr>
-              <w:jc w:val="center"/>
-            </w:pPr>
-            <w:r>
-              <w:rPr>
-                <w:rFonts w:ascii="Arial" w:hAnsi="Arial"/>
-                <w:b/>
-                <w:sz w:val="18"/>
-              </w:rPr>
-              <w:t>Training Strategy</w:t>
-            </w:r>
-          </w:p>
-        </w:tc>
-        <w:tc>
-          <w:tcPr>
-            <w:tcW w:type="dxa" w:w="1567"/>
-          </w:tcPr>
-          <w:p>
-            <w:pPr>
-              <w:jc w:val="center"/>
-            </w:pPr>
-            <w:r>
-              <w:rPr>
-                <w:rFonts w:ascii="Arial" w:hAnsi="Arial"/>
-                <w:b/>
-                <w:sz w:val="18"/>
-              </w:rPr>
-              <w:t>Total Epochs</w:t>
-            </w:r>
-          </w:p>
-        </w:tc>
-        <w:tc>
-          <w:tcPr>
-            <w:tcW w:type="dxa" w:w="1567"/>
-          </w:tcPr>
-          <w:p>
-            <w:pPr>
-              <w:jc w:val="center"/>
-            </w:pPr>
-            <w:r>
-              <w:rPr>
-                <w:rFonts w:ascii="Arial" w:hAnsi="Arial"/>
-                <w:b/>
-                <w:sz w:val="18"/>
-              </w:rPr>
-              <w:t>Learning Rate</w:t>
-            </w:r>
-          </w:p>
-        </w:tc>
-        <w:tc>
-          <w:tcPr>
-            <w:tcW w:type="dxa" w:w="1567"/>
-          </w:tcPr>
-          <w:p>
-            <w:pPr>
-              <w:jc w:val="center"/>
-            </w:pPr>
-            <w:r>
-              <w:rPr>
-                <w:rFonts w:ascii="Arial" w:hAnsi="Arial"/>
-                <w:b/>
-                <w:sz w:val="18"/>
-              </w:rPr>
-              <w:t>Callbacks Used</w:t>
-            </w:r>
-          </w:p>
-        </w:tc>
-        <w:tc>
-          <w:tcPr>
-            <w:tcW w:type="dxa" w:w="1567"/>
-          </w:tcPr>
-          <w:p>
-            <w:pPr>
-              <w:jc w:val="center"/>
-            </w:pPr>
-            <w:r>
-              <w:rPr>
-                <w:rFonts w:ascii="Arial" w:hAnsi="Arial"/>
-                <w:b/>
-                <w:sz w:val="18"/>
-              </w:rPr>
-              <w:t>Batch Size</w:t>
-            </w:r>
-          </w:p>
-        </w:tc>
-      </w:tr>
-      <w:tr>
-        <w:tc>
-          <w:tcPr>
-            <w:tcW w:type="dxa" w:w="1567"/>
-          </w:tcPr>
-          <w:p>
-            <w:r>
-              <w:rPr>
-                <w:rFonts w:ascii="Times New Roman" w:hAnsi="Times New Roman"/>
-                <w:sz w:val="18"/>
-              </w:rPr>
-              <w:t>Kaggle Baseline</w:t>
-            </w:r>
-          </w:p>
-        </w:tc>
-        <w:tc>
-          <w:tcPr>
-            <w:tcW w:type="dxa" w:w="1567"/>
-          </w:tcPr>
-          <w:p>
-            <w:r>
-              <w:rPr>
-                <w:rFonts w:ascii="Times New Roman" w:hAnsi="Times New Roman"/>
-                <w:sz w:val="18"/>
-              </w:rPr>
-              <w:t>Full scratch training</w:t>
-            </w:r>
-          </w:p>
-        </w:tc>
-        <w:tc>
-          <w:tcPr>
-            <w:tcW w:type="dxa" w:w="1567"/>
-          </w:tcPr>
-          <w:p>
-            <w:r>
-              <w:rPr>
-                <w:rFonts w:ascii="Times New Roman" w:hAnsi="Times New Roman"/>
-                <w:sz w:val="18"/>
-              </w:rPr>
-              <w:t>50</w:t>
-            </w:r>
-          </w:p>
-        </w:tc>
-        <w:tc>
-          <w:tcPr>
-            <w:tcW w:type="dxa" w:w="1567"/>
-          </w:tcPr>
-          <w:p>
-            <w:r>
-              <w:rPr>
-                <w:rFonts w:ascii="Times New Roman" w:hAnsi="Times New Roman"/>
-                <w:sz w:val="18"/>
-              </w:rPr>
-              <w:t>0.001 (fixed)</w:t>
-            </w:r>
-          </w:p>
-        </w:tc>
-        <w:tc>
-          <w:tcPr>
-            <w:tcW w:type="dxa" w:w="1567"/>
-          </w:tcPr>
-          <w:p>
-            <w:r>
-              <w:rPr>
-                <w:rFonts w:ascii="Times New Roman" w:hAnsi="Times New Roman"/>
-                <w:sz w:val="18"/>
-              </w:rPr>
-              <w:t>None</w:t>
-            </w:r>
-          </w:p>
-        </w:tc>
-        <w:tc>
-          <w:tcPr>
-            <w:tcW w:type="dxa" w:w="1567"/>
-          </w:tcPr>
-          <w:p>
-            <w:r>
-              <w:rPr>
-                <w:rFonts w:ascii="Times New Roman" w:hAnsi="Times New Roman"/>
-                <w:sz w:val="18"/>
-              </w:rPr>
-              <w:t>32</w:t>
-            </w:r>
-          </w:p>
-        </w:tc>
-      </w:tr>
-      <w:tr>
-        <w:tc>
-          <w:tcPr>
-            <w:tcW w:type="dxa" w:w="1567"/>
-          </w:tcPr>
-          <w:p>
-            <w:r>
-              <w:rPr>
-                <w:rFonts w:ascii="Times New Roman" w:hAnsi="Times New Roman"/>
-                <w:sz w:val="18"/>
-              </w:rPr>
-              <w:t>Thakur &amp; Sharma</w:t>
-            </w:r>
-          </w:p>
-        </w:tc>
-        <w:tc>
-          <w:tcPr>
-            <w:tcW w:type="dxa" w:w="1567"/>
-          </w:tcPr>
-          <w:p>
-            <w:r>
-              <w:rPr>
-                <w:rFonts w:ascii="Times New Roman" w:hAnsi="Times New Roman"/>
-                <w:sz w:val="18"/>
-              </w:rPr>
-              <w:t>Freeze all, fine-tune last 3 layers</w:t>
-            </w:r>
-          </w:p>
-        </w:tc>
-        <w:tc>
-          <w:tcPr>
-            <w:tcW w:type="dxa" w:w="1567"/>
-          </w:tcPr>
-          <w:p>
-            <w:r>
-              <w:rPr>
-                <w:rFonts w:ascii="Times New Roman" w:hAnsi="Times New Roman"/>
-                <w:sz w:val="18"/>
-              </w:rPr>
-              <w:t>30</w:t>
-            </w:r>
-          </w:p>
-        </w:tc>
-        <w:tc>
-          <w:tcPr>
-            <w:tcW w:type="dxa" w:w="1567"/>
-          </w:tcPr>
-          <w:p>
-            <w:r>
-              <w:rPr>
-                <w:rFonts w:ascii="Times New Roman" w:hAnsi="Times New Roman"/>
-                <w:sz w:val="18"/>
-              </w:rPr>
-              <w:t>1e-4 (fixed)</w:t>
-            </w:r>
-          </w:p>
-        </w:tc>
-        <w:tc>
-          <w:tcPr>
-            <w:tcW w:type="dxa" w:w="1567"/>
-          </w:tcPr>
-          <w:p>
-            <w:r>
-              <w:rPr>
-                <w:rFonts w:ascii="Times New Roman" w:hAnsi="Times New Roman"/>
-                <w:sz w:val="18"/>
-              </w:rPr>
-              <w:t>EarlyStopping (patience=5)</w:t>
-            </w:r>
-          </w:p>
-        </w:tc>
-        <w:tc>
-          <w:tcPr>
-            <w:tcW w:type="dxa" w:w="1567"/>
-          </w:tcPr>
-          <w:p>
-            <w:r>
-              <w:rPr>
-                <w:rFonts w:ascii="Times New Roman" w:hAnsi="Times New Roman"/>
-                <w:sz w:val="18"/>
-              </w:rPr>
-              <w:t>16</w:t>
-            </w:r>
-          </w:p>
-        </w:tc>
-      </w:tr>
-      <w:tr>
-        <w:tc>
-          <w:tcPr>
-            <w:tcW w:type="dxa" w:w="1567"/>
-          </w:tcPr>
-          <w:p>
-            <w:r>
-              <w:rPr>
-                <w:rFonts w:ascii="Times New Roman" w:hAnsi="Times New Roman"/>
-                <w:sz w:val="18"/>
-              </w:rPr>
-              <w:t>Zhang et al.</w:t>
-            </w:r>
-          </w:p>
-        </w:tc>
-        <w:tc>
-          <w:tcPr>
-            <w:tcW w:type="dxa" w:w="1567"/>
-          </w:tcPr>
-          <w:p>
-            <w:r>
-              <w:rPr>
-                <w:rFonts w:ascii="Times New Roman" w:hAnsi="Times New Roman"/>
-                <w:sz w:val="18"/>
-              </w:rPr>
-              <w:t>Fine-tune last ResNet block</w:t>
-            </w:r>
-          </w:p>
-        </w:tc>
-        <w:tc>
-          <w:tcPr>
-            <w:tcW w:type="dxa" w:w="1567"/>
-          </w:tcPr>
-          <w:p>
-            <w:r>
-              <w:rPr>
-                <w:rFonts w:ascii="Times New Roman" w:hAnsi="Times New Roman"/>
-                <w:sz w:val="18"/>
-              </w:rPr>
-              <w:t>40</w:t>
-            </w:r>
-          </w:p>
-        </w:tc>
-        <w:tc>
-          <w:tcPr>
-            <w:tcW w:type="dxa" w:w="1567"/>
-          </w:tcPr>
-          <w:p>
-            <w:r>
-              <w:rPr>
-                <w:rFonts w:ascii="Times New Roman" w:hAnsi="Times New Roman"/>
-                <w:sz w:val="18"/>
-              </w:rPr>
-              <w:t>5e-5 (fixed)</w:t>
-            </w:r>
-          </w:p>
-        </w:tc>
-        <w:tc>
-          <w:tcPr>
-            <w:tcW w:type="dxa" w:w="1567"/>
-          </w:tcPr>
-          <w:p>
-            <w:r>
-              <w:rPr>
-                <w:rFonts w:ascii="Times New Roman" w:hAnsi="Times New Roman"/>
-                <w:sz w:val="18"/>
-              </w:rPr>
-              <w:t>ReduceLROnPlateau</w:t>
-            </w:r>
-          </w:p>
-        </w:tc>
-        <w:tc>
-          <w:tcPr>
-            <w:tcW w:type="dxa" w:w="1567"/>
-          </w:tcPr>
-          <w:p>
-            <w:r>
-              <w:rPr>
-                <w:rFonts w:ascii="Times New Roman" w:hAnsi="Times New Roman"/>
-                <w:sz w:val="18"/>
-              </w:rPr>
-              <w:t>32</w:t>
-            </w:r>
-          </w:p>
-        </w:tc>
-      </w:tr>
-      <w:tr>
-        <w:tc>
-          <w:tcPr>
-            <w:tcW w:type="dxa" w:w="1567"/>
-          </w:tcPr>
-          <w:p>
-            <w:r>
-              <w:rPr>
-                <w:rFonts w:ascii="Times New Roman" w:hAnsi="Times New Roman"/>
-                <w:sz w:val="18"/>
-              </w:rPr>
-              <w:t>Nowakowski et al.</w:t>
-            </w:r>
-          </w:p>
-        </w:tc>
-        <w:tc>
-          <w:tcPr>
-            <w:tcW w:type="dxa" w:w="1567"/>
-          </w:tcPr>
-          <w:p>
-            <w:r>
-              <w:rPr>
-                <w:rFonts w:ascii="Times New Roman" w:hAnsi="Times New Roman"/>
-                <w:sz w:val="18"/>
-              </w:rPr>
-              <w:t>Single-phase full fine-tune</w:t>
-            </w:r>
-          </w:p>
-        </w:tc>
-        <w:tc>
-          <w:tcPr>
-            <w:tcW w:type="dxa" w:w="1567"/>
-          </w:tcPr>
-          <w:p>
-            <w:r>
-              <w:rPr>
-                <w:rFonts w:ascii="Times New Roman" w:hAnsi="Times New Roman"/>
-                <w:sz w:val="18"/>
-              </w:rPr>
-              <w:t>25</w:t>
-            </w:r>
-          </w:p>
-        </w:tc>
-        <w:tc>
-          <w:tcPr>
-            <w:tcW w:type="dxa" w:w="1567"/>
-          </w:tcPr>
-          <w:p>
-            <w:r>
-              <w:rPr>
-                <w:rFonts w:ascii="Times New Roman" w:hAnsi="Times New Roman"/>
-                <w:sz w:val="18"/>
-              </w:rPr>
-              <w:t>1e-4 (fixed)</w:t>
-            </w:r>
-          </w:p>
-        </w:tc>
-        <w:tc>
-          <w:tcPr>
-            <w:tcW w:type="dxa" w:w="1567"/>
-          </w:tcPr>
-          <w:p>
-            <w:r>
-              <w:rPr>
-                <w:rFonts w:ascii="Times New Roman" w:hAnsi="Times New Roman"/>
-                <w:sz w:val="18"/>
-              </w:rPr>
-              <w:t>EarlyStopping</w:t>
-            </w:r>
-          </w:p>
-        </w:tc>
-        <w:tc>
-          <w:tcPr>
-            <w:tcW w:type="dxa" w:w="1567"/>
-          </w:tcPr>
-          <w:p>
-            <w:r>
-              <w:rPr>
-                <w:rFonts w:ascii="Times New Roman" w:hAnsi="Times New Roman"/>
-                <w:sz w:val="18"/>
-              </w:rPr>
-              <w:t>64</w:t>
-            </w:r>
-          </w:p>
-        </w:tc>
-      </w:tr>
-      <w:tr>
-        <w:tc>
-          <w:tcPr>
-            <w:tcW w:type="dxa" w:w="1567"/>
-          </w:tcPr>
-          <w:p>
-            <w:r>
-              <w:rPr>
-                <w:rFonts w:ascii="Times New Roman" w:hAnsi="Times New Roman"/>
-                <w:sz w:val="18"/>
-              </w:rPr>
-              <w:t>Mishra &amp; Gupta</w:t>
-            </w:r>
-          </w:p>
-        </w:tc>
-        <w:tc>
-          <w:tcPr>
-            <w:tcW w:type="dxa" w:w="1567"/>
-          </w:tcPr>
-          <w:p>
-            <w:r>
-              <w:rPr>
-                <w:rFonts w:ascii="Times New Roman" w:hAnsi="Times New Roman"/>
-                <w:sz w:val="18"/>
-              </w:rPr>
-              <w:t>Fine-tune top 50% of layers</w:t>
-            </w:r>
-          </w:p>
-        </w:tc>
-        <w:tc>
-          <w:tcPr>
-            <w:tcW w:type="dxa" w:w="1567"/>
-          </w:tcPr>
-          <w:p>
-            <w:r>
-              <w:rPr>
-                <w:rFonts w:ascii="Times New Roman" w:hAnsi="Times New Roman"/>
-                <w:sz w:val="18"/>
-              </w:rPr>
-              <w:t>35</w:t>
-            </w:r>
-          </w:p>
-        </w:tc>
-        <w:tc>
-          <w:tcPr>
-            <w:tcW w:type="dxa" w:w="1567"/>
-          </w:tcPr>
-          <w:p>
-            <w:r>
-              <w:rPr>
-                <w:rFonts w:ascii="Times New Roman" w:hAnsi="Times New Roman"/>
-                <w:sz w:val="18"/>
-              </w:rPr>
-              <w:t>1e-4 (fixed)</w:t>
-            </w:r>
-          </w:p>
-        </w:tc>
-        <w:tc>
-          <w:tcPr>
-            <w:tcW w:type="dxa" w:w="1567"/>
-          </w:tcPr>
-          <w:p>
-            <w:r>
-              <w:rPr>
-                <w:rFonts w:ascii="Times New Roman" w:hAnsi="Times New Roman"/>
-                <w:sz w:val="18"/>
-              </w:rPr>
-              <w:t>ModelCheckpoint</w:t>
-            </w:r>
-          </w:p>
-        </w:tc>
-        <w:tc>
-          <w:tcPr>
-            <w:tcW w:type="dxa" w:w="1567"/>
-          </w:tcPr>
-          <w:p>
-            <w:r>
-              <w:rPr>
-                <w:rFonts w:ascii="Times New Roman" w:hAnsi="Times New Roman"/>
-                <w:sz w:val="18"/>
-              </w:rPr>
-              <w:t>32</w:t>
-            </w:r>
-          </w:p>
-        </w:tc>
-      </w:tr>
-      <w:tr>
-        <w:tc>
-          <w:tcPr>
-            <w:tcW w:type="dxa" w:w="1567"/>
-          </w:tcPr>
-          <w:p>
-            <w:r>
-              <w:rPr>
-                <w:rFonts w:ascii="Times New Roman" w:hAnsi="Times New Roman"/>
-                <w:sz w:val="18"/>
-              </w:rPr>
-              <w:t>Patel et al.</w:t>
-            </w:r>
-          </w:p>
-        </w:tc>
-        <w:tc>
-          <w:tcPr>
-            <w:tcW w:type="dxa" w:w="1567"/>
-          </w:tcPr>
-          <w:p>
-            <w:r>
-              <w:rPr>
-                <w:rFonts w:ascii="Times New Roman" w:hAnsi="Times New Roman"/>
-                <w:sz w:val="18"/>
-              </w:rPr>
-              <w:t>Feature extraction only</w:t>
-            </w:r>
-          </w:p>
-        </w:tc>
-        <w:tc>
-          <w:tcPr>
-            <w:tcW w:type="dxa" w:w="1567"/>
-          </w:tcPr>
-          <w:p>
-            <w:r>
-              <w:rPr>
-                <w:rFonts w:ascii="Times New Roman" w:hAnsi="Times New Roman"/>
-                <w:sz w:val="18"/>
-              </w:rPr>
-              <w:t>20</w:t>
-            </w:r>
-          </w:p>
-        </w:tc>
-        <w:tc>
-          <w:tcPr>
-            <w:tcW w:type="dxa" w:w="1567"/>
-          </w:tcPr>
-          <w:p>
-            <w:r>
-              <w:rPr>
-                <w:rFonts w:ascii="Times New Roman" w:hAnsi="Times New Roman"/>
-                <w:sz w:val="18"/>
-              </w:rPr>
-              <w:t>1e-3 (fixed)</w:t>
-            </w:r>
-          </w:p>
-        </w:tc>
-        <w:tc>
-          <w:tcPr>
-            <w:tcW w:type="dxa" w:w="1567"/>
-          </w:tcPr>
-          <w:p>
-            <w:r>
-              <w:rPr>
-                <w:rFonts w:ascii="Times New Roman" w:hAnsi="Times New Roman"/>
-                <w:sz w:val="18"/>
-              </w:rPr>
-              <w:t>EarlyStopping</w:t>
-            </w:r>
-          </w:p>
-        </w:tc>
-        <w:tc>
-          <w:tcPr>
-            <w:tcW w:type="dxa" w:w="1567"/>
-          </w:tcPr>
-          <w:p>
-            <w:r>
-              <w:rPr>
-                <w:rFonts w:ascii="Times New Roman" w:hAnsi="Times New Roman"/>
-                <w:sz w:val="18"/>
-              </w:rPr>
-              <w:t>32</w:t>
-            </w:r>
-          </w:p>
-        </w:tc>
-      </w:tr>
-      <w:tr>
-        <w:tc>
-          <w:tcPr>
-            <w:tcW w:type="dxa" w:w="1567"/>
-          </w:tcPr>
-          <w:p>
-            <w:r>
-              <w:rPr>
-                <w:rFonts w:ascii="Times New Roman" w:hAnsi="Times New Roman"/>
-                <w:sz w:val="18"/>
-              </w:rPr>
-              <w:t>THIS PROJECT (GGV)</w:t>
-            </w:r>
-          </w:p>
-        </w:tc>
-        <w:tc>
-          <w:tcPr>
-            <w:tcW w:type="dxa" w:w="1567"/>
-          </w:tcPr>
-          <w:p>
-            <w:r>
-              <w:rPr>
-                <w:rFonts w:ascii="Times New Roman" w:hAnsi="Times New Roman"/>
-                <w:sz w:val="18"/>
-              </w:rPr>
-              <w:t>Phase1: Head only, Phase2: Full</w:t>
-            </w:r>
-          </w:p>
-        </w:tc>
-        <w:tc>
-          <w:tcPr>
-            <w:tcW w:type="dxa" w:w="1567"/>
-          </w:tcPr>
-          <w:p>
-            <w:r>
-              <w:rPr>
-                <w:rFonts w:ascii="Times New Roman" w:hAnsi="Times New Roman"/>
-                <w:sz w:val="18"/>
-              </w:rPr>
-              <w:t>27 (15+12)</w:t>
-            </w:r>
-          </w:p>
-        </w:tc>
-        <w:tc>
-          <w:tcPr>
-            <w:tcW w:type="dxa" w:w="1567"/>
-          </w:tcPr>
-          <w:p>
-            <w:r>
-              <w:rPr>
-                <w:rFonts w:ascii="Times New Roman" w:hAnsi="Times New Roman"/>
-                <w:sz w:val="18"/>
-              </w:rPr>
-              <w:t>0.001 -&gt; 5e-5 (adaptive)</w:t>
-            </w:r>
-          </w:p>
-        </w:tc>
-        <w:tc>
-          <w:tcPr>
-            <w:tcW w:type="dxa" w:w="1567"/>
-          </w:tcPr>
-          <w:p>
-            <w:r>
-              <w:rPr>
-                <w:rFonts w:ascii="Times New Roman" w:hAnsi="Times New Roman"/>
-                <w:sz w:val="18"/>
-              </w:rPr>
-              <w:t>EarlyStopping + ReduceLR + Checkpoint</w:t>
-            </w:r>
-          </w:p>
-        </w:tc>
-        <w:tc>
-          <w:tcPr>
-            <w:tcW w:type="dxa" w:w="1567"/>
-          </w:tcPr>
-          <w:p>
-            <w:r>
-              <w:rPr>
-                <w:rFonts w:ascii="Times New Roman" w:hAnsi="Times New Roman"/>
-                <w:sz w:val="18"/>
-              </w:rPr>
-              <w:t>32</w:t>
-            </w:r>
-          </w:p>
-        </w:tc>
-      </w:tr>
-    </w:tbl>
-    <w:p>
-      <w:pPr>
-        <w:spacing w:before="80"/>
-        <w:jc w:val="center"/>
-      </w:pPr>
-      <w:r>
-        <w:rPr>
-          <w:i/>
-          <w:sz w:val="18"/>
-        </w:rPr>
-        <w:t>Table 9A.2: Training Methodology Comparison — Same Dataset</w:t>
-      </w:r>
-    </w:p>
-    <w:p>
-      <w:pPr>
-        <w:spacing w:after="200" w:before="80"/>
-      </w:pPr>
-      <w:r>
-        <w:rPr>
-          <w:rFonts w:ascii="Times New Roman" w:hAnsi="Times New Roman"/>
-          <w:b w:val="0"/>
-          <w:sz w:val="24"/>
-        </w:rPr>
-        <w:t>The Two-Phase training protocol implemented in this project is the most sophisticated methodology among all compared works. Competing studies predominantly adopt single-phase approaches — fine-tuning fixed subsets of layers at constant learning rates. The most critical methodological weakness of these single-phase approaches is the risk of catastrophic forgetting: when a randomly initialized classification head produces large gradient signals in the first training iterations, those gradients propagate into the pre-trained backbone layers, progressively corrupting the ImageNet feature representations that make Transfer Learning valuable. Patel et al.'s pure feature extraction approach avoids this but prevents the backbone from adapting to waste-domain features at all.</w:t>
-      </w:r>
-    </w:p>
-    <w:p>
-      <w:pPr>
-        <w:spacing w:after="200" w:before="80"/>
-      </w:pPr>
-      <w:r>
-        <w:rPr>
-          <w:rFonts w:ascii="Times New Roman" w:hAnsi="Times New Roman"/>
-          <w:b w:val="0"/>
-          <w:sz w:val="24"/>
-        </w:rPr>
-        <w:t>Our Phase 1 warm-up (15 epochs, head only) allows the randomly initialized dense layer to converge to a stable state before any gradients touch the backbone. By Phase 2, the head's gradients are small and well-directed, enabling safe global fine-tuning at 5e-5 — a learning rate 20x smaller than Phase 1. The combination of EarlyStopping (patience=7), ReduceLROnPlateau (factor=0.3, patience=5), and ModelCheckpoint with best-weight restoration creates a robust optimization landscape that consistently finds superior minima compared to fixed-LR training with simple EarlyStopping.</w:t>
-      </w:r>
-    </w:p>
-    <w:p>
-      <w:pPr>
-        <w:pStyle w:val="Heading2"/>
-        <w:spacing w:before="280" w:after="160"/>
-      </w:pPr>
-      <w:r>
-        <w:rPr>
-          <w:rFonts w:ascii="Arial" w:hAnsi="Arial"/>
-          <w:b/>
-          <w:color w:val="1F497D"/>
-          <w:sz w:val="26"/>
-        </w:rPr>
-        <w:t>9-A.3  Deployment and Practical Usability Comparison</w:t>
-      </w:r>
-    </w:p>
-    <w:p>
-      <w:pPr>
-        <w:spacing w:after="200" w:before="80"/>
-      </w:pPr>
-      <w:r>
-        <w:rPr>
-          <w:rFonts w:ascii="Times New Roman" w:hAnsi="Times New Roman"/>
-          <w:b w:val="0"/>
-          <w:sz w:val="24"/>
-        </w:rPr>
-        <w:t>Research impact is measured not only by accuracy but by the practical accessibility of the implemented system. The following table evaluates all compared systems on deployment completeness and usability features:</w:t>
-      </w:r>
-    </w:p>
-    <w:tbl>
-      <w:tblPr>
-        <w:tblStyle w:val="TableGrid"/>
-        <w:tblW w:type="auto" w:w="0"/>
-        <w:tblLook w:firstColumn="1" w:firstRow="1" w:lastColumn="0" w:lastRow="0" w:noHBand="0" w:noVBand="1" w:val="04A0"/>
-      </w:tblPr>
-      <w:tblGrid>
-        <w:gridCol w:w="1344"/>
-        <w:gridCol w:w="1344"/>
-        <w:gridCol w:w="1344"/>
-        <w:gridCol w:w="1344"/>
-        <w:gridCol w:w="1344"/>
-        <w:gridCol w:w="1344"/>
-        <w:gridCol w:w="1344"/>
-      </w:tblGrid>
-      <w:tr>
-        <w:tc>
-          <w:tcPr>
-            <w:tcW w:type="dxa" w:w="1344"/>
-          </w:tcPr>
-          <w:p>
-            <w:pPr>
-              <w:jc w:val="center"/>
-            </w:pPr>
-            <w:r>
-              <w:rPr>
-                <w:rFonts w:ascii="Arial" w:hAnsi="Arial"/>
-                <w:b/>
-                <w:sz w:val="18"/>
-              </w:rPr>
-              <w:t>Feature</w:t>
-            </w:r>
-          </w:p>
-        </w:tc>
-        <w:tc>
-          <w:tcPr>
-            <w:tcW w:type="dxa" w:w="1344"/>
-          </w:tcPr>
-          <w:p>
-            <w:pPr>
-              <w:jc w:val="center"/>
-            </w:pPr>
-            <w:r>
-              <w:rPr>
-                <w:rFonts w:ascii="Arial" w:hAnsi="Arial"/>
-                <w:b/>
-                <w:sz w:val="18"/>
-              </w:rPr>
-              <w:t>Kaggle Base</w:t>
-            </w:r>
-          </w:p>
-        </w:tc>
-        <w:tc>
-          <w:tcPr>
-            <w:tcW w:type="dxa" w:w="1344"/>
-          </w:tcPr>
-          <w:p>
-            <w:pPr>
-              <w:jc w:val="center"/>
-            </w:pPr>
-            <w:r>
-              <w:rPr>
-                <w:rFonts w:ascii="Arial" w:hAnsi="Arial"/>
-                <w:b/>
-                <w:sz w:val="18"/>
-              </w:rPr>
-              <w:t>VGG-16</w:t>
-            </w:r>
-          </w:p>
-        </w:tc>
-        <w:tc>
-          <w:tcPr>
-            <w:tcW w:type="dxa" w:w="1344"/>
-          </w:tcPr>
-          <w:p>
-            <w:pPr>
-              <w:jc w:val="center"/>
-            </w:pPr>
-            <w:r>
-              <w:rPr>
-                <w:rFonts w:ascii="Arial" w:hAnsi="Arial"/>
-                <w:b/>
-                <w:sz w:val="18"/>
-              </w:rPr>
-              <w:t>ResNet</w:t>
-            </w:r>
-          </w:p>
-        </w:tc>
-        <w:tc>
-          <w:tcPr>
-            <w:tcW w:type="dxa" w:w="1344"/>
-          </w:tcPr>
-          <w:p>
-            <w:pPr>
-              <w:jc w:val="center"/>
-            </w:pPr>
-            <w:r>
-              <w:rPr>
-                <w:rFonts w:ascii="Arial" w:hAnsi="Arial"/>
-                <w:b/>
-                <w:sz w:val="18"/>
-              </w:rPr>
-              <w:t>MobileNet</w:t>
-            </w:r>
-          </w:p>
-        </w:tc>
-        <w:tc>
-          <w:tcPr>
-            <w:tcW w:type="dxa" w:w="1344"/>
-          </w:tcPr>
-          <w:p>
-            <w:pPr>
-              <w:jc w:val="center"/>
-            </w:pPr>
-            <w:r>
-              <w:rPr>
-                <w:rFonts w:ascii="Arial" w:hAnsi="Arial"/>
-                <w:b/>
-                <w:sz w:val="18"/>
-              </w:rPr>
-              <w:t>DenseNet</w:t>
-            </w:r>
-          </w:p>
-        </w:tc>
-        <w:tc>
-          <w:tcPr>
-            <w:tcW w:type="dxa" w:w="1344"/>
-          </w:tcPr>
-          <w:p>
-            <w:pPr>
-              <w:jc w:val="center"/>
-            </w:pPr>
-            <w:r>
-              <w:rPr>
-                <w:rFonts w:ascii="Arial" w:hAnsi="Arial"/>
-                <w:b/>
-                <w:sz w:val="18"/>
-              </w:rPr>
-              <w:t>THIS PROJECT</w:t>
-            </w:r>
-          </w:p>
-        </w:tc>
-      </w:tr>
-      <w:tr>
-        <w:tc>
-          <w:tcPr>
-            <w:tcW w:type="dxa" w:w="1344"/>
-          </w:tcPr>
-          <w:p>
-            <w:r>
-              <w:rPr>
-                <w:rFonts w:ascii="Times New Roman" w:hAnsi="Times New Roman"/>
-                <w:sz w:val="18"/>
-              </w:rPr>
-              <w:t>Overall Accuracy</w:t>
-            </w:r>
-          </w:p>
-        </w:tc>
-        <w:tc>
-          <w:tcPr>
-            <w:tcW w:type="dxa" w:w="1344"/>
-          </w:tcPr>
-          <w:p>
-            <w:r>
-              <w:rPr>
-                <w:rFonts w:ascii="Times New Roman" w:hAnsi="Times New Roman"/>
-                <w:sz w:val="18"/>
-              </w:rPr>
-              <w:t>74.1%</w:t>
-            </w:r>
-          </w:p>
-        </w:tc>
-        <w:tc>
-          <w:tcPr>
-            <w:tcW w:type="dxa" w:w="1344"/>
-          </w:tcPr>
-          <w:p>
-            <w:r>
-              <w:rPr>
-                <w:rFonts w:ascii="Times New Roman" w:hAnsi="Times New Roman"/>
-                <w:sz w:val="18"/>
-              </w:rPr>
-              <w:t>88.3%</w:t>
-            </w:r>
-          </w:p>
-        </w:tc>
-        <w:tc>
-          <w:tcPr>
-            <w:tcW w:type="dxa" w:w="1344"/>
-          </w:tcPr>
-          <w:p>
-            <w:r>
-              <w:rPr>
-                <w:rFonts w:ascii="Times New Roman" w:hAnsi="Times New Roman"/>
-                <w:sz w:val="18"/>
-              </w:rPr>
-              <w:t>91.5%</w:t>
-            </w:r>
-          </w:p>
-        </w:tc>
-        <w:tc>
-          <w:tcPr>
-            <w:tcW w:type="dxa" w:w="1344"/>
-          </w:tcPr>
-          <w:p>
-            <w:r>
-              <w:rPr>
-                <w:rFonts w:ascii="Times New Roman" w:hAnsi="Times New Roman"/>
-                <w:sz w:val="18"/>
-              </w:rPr>
-              <w:t>94.0%</w:t>
-            </w:r>
-          </w:p>
-        </w:tc>
-        <w:tc>
-          <w:tcPr>
-            <w:tcW w:type="dxa" w:w="1344"/>
-          </w:tcPr>
-          <w:p>
-            <w:r>
-              <w:rPr>
-                <w:rFonts w:ascii="Times New Roman" w:hAnsi="Times New Roman"/>
-                <w:sz w:val="18"/>
-              </w:rPr>
-              <w:t>93.8%</w:t>
-            </w:r>
-          </w:p>
-        </w:tc>
-        <w:tc>
-          <w:tcPr>
-            <w:tcW w:type="dxa" w:w="1344"/>
-          </w:tcPr>
-          <w:p>
-            <w:r>
-              <w:rPr>
-                <w:rFonts w:ascii="Times New Roman" w:hAnsi="Times New Roman"/>
-                <w:sz w:val="18"/>
-              </w:rPr>
-              <w:t>97.0% [BEST]</w:t>
-            </w:r>
-          </w:p>
-        </w:tc>
-      </w:tr>
-      <w:tr>
-        <w:tc>
-          <w:tcPr>
-            <w:tcW w:type="dxa" w:w="1344"/>
-          </w:tcPr>
-          <w:p>
-            <w:r>
-              <w:rPr>
-                <w:rFonts w:ascii="Times New Roman" w:hAnsi="Times New Roman"/>
-                <w:sz w:val="18"/>
-              </w:rPr>
-              <w:t>Web Application Deployed</w:t>
-            </w:r>
-          </w:p>
-        </w:tc>
-        <w:tc>
-          <w:tcPr>
-            <w:tcW w:type="dxa" w:w="1344"/>
-          </w:tcPr>
-          <w:p>
-            <w:r>
-              <w:rPr>
-                <w:rFonts w:ascii="Times New Roman" w:hAnsi="Times New Roman"/>
-                <w:sz w:val="18"/>
-              </w:rPr>
-              <w:t>No</w:t>
-            </w:r>
-          </w:p>
-        </w:tc>
-        <w:tc>
-          <w:tcPr>
-            <w:tcW w:type="dxa" w:w="1344"/>
-          </w:tcPr>
-          <w:p>
-            <w:r>
-              <w:rPr>
-                <w:rFonts w:ascii="Times New Roman" w:hAnsi="Times New Roman"/>
-                <w:sz w:val="18"/>
-              </w:rPr>
-              <w:t>No</w:t>
-            </w:r>
-          </w:p>
-        </w:tc>
-        <w:tc>
-          <w:tcPr>
-            <w:tcW w:type="dxa" w:w="1344"/>
-          </w:tcPr>
-          <w:p>
-            <w:r>
-              <w:rPr>
-                <w:rFonts w:ascii="Times New Roman" w:hAnsi="Times New Roman"/>
-                <w:sz w:val="18"/>
-              </w:rPr>
-              <w:t>No</w:t>
-            </w:r>
-          </w:p>
-        </w:tc>
-        <w:tc>
-          <w:tcPr>
-            <w:tcW w:type="dxa" w:w="1344"/>
-          </w:tcPr>
-          <w:p>
-            <w:r>
-              <w:rPr>
-                <w:rFonts w:ascii="Times New Roman" w:hAnsi="Times New Roman"/>
-                <w:sz w:val="18"/>
-              </w:rPr>
-              <w:t>No</w:t>
-            </w:r>
-          </w:p>
-        </w:tc>
-        <w:tc>
-          <w:tcPr>
-            <w:tcW w:type="dxa" w:w="1344"/>
-          </w:tcPr>
-          <w:p>
-            <w:r>
-              <w:rPr>
-                <w:rFonts w:ascii="Times New Roman" w:hAnsi="Times New Roman"/>
-                <w:sz w:val="18"/>
-              </w:rPr>
-              <w:t>No</w:t>
-            </w:r>
-          </w:p>
-        </w:tc>
-        <w:tc>
-          <w:tcPr>
-            <w:tcW w:type="dxa" w:w="1344"/>
-          </w:tcPr>
-          <w:p>
-            <w:r>
-              <w:rPr>
-                <w:rFonts w:ascii="Times New Roman" w:hAnsi="Times New Roman"/>
-                <w:sz w:val="18"/>
-              </w:rPr>
-              <w:t>Yes (Flask)</w:t>
-            </w:r>
-          </w:p>
-        </w:tc>
-      </w:tr>
-      <w:tr>
-        <w:tc>
-          <w:tcPr>
-            <w:tcW w:type="dxa" w:w="1344"/>
-          </w:tcPr>
-          <w:p>
-            <w:r>
-              <w:rPr>
-                <w:rFonts w:ascii="Times New Roman" w:hAnsi="Times New Roman"/>
-                <w:sz w:val="18"/>
-              </w:rPr>
-              <w:t>Real-Time Image Upload API</w:t>
-            </w:r>
-          </w:p>
-        </w:tc>
-        <w:tc>
-          <w:tcPr>
-            <w:tcW w:type="dxa" w:w="1344"/>
-          </w:tcPr>
-          <w:p>
-            <w:r>
-              <w:rPr>
-                <w:rFonts w:ascii="Times New Roman" w:hAnsi="Times New Roman"/>
-                <w:sz w:val="18"/>
-              </w:rPr>
-              <w:t>No</w:t>
-            </w:r>
-          </w:p>
-        </w:tc>
-        <w:tc>
-          <w:tcPr>
-            <w:tcW w:type="dxa" w:w="1344"/>
-          </w:tcPr>
-          <w:p>
-            <w:r>
-              <w:rPr>
-                <w:rFonts w:ascii="Times New Roman" w:hAnsi="Times New Roman"/>
-                <w:sz w:val="18"/>
-              </w:rPr>
-              <w:t>No</w:t>
-            </w:r>
-          </w:p>
-        </w:tc>
-        <w:tc>
-          <w:tcPr>
-            <w:tcW w:type="dxa" w:w="1344"/>
-          </w:tcPr>
-          <w:p>
-            <w:r>
-              <w:rPr>
-                <w:rFonts w:ascii="Times New Roman" w:hAnsi="Times New Roman"/>
-                <w:sz w:val="18"/>
-              </w:rPr>
-              <w:t>No</w:t>
-            </w:r>
-          </w:p>
-        </w:tc>
-        <w:tc>
-          <w:tcPr>
-            <w:tcW w:type="dxa" w:w="1344"/>
-          </w:tcPr>
-          <w:p>
-            <w:r>
-              <w:rPr>
-                <w:rFonts w:ascii="Times New Roman" w:hAnsi="Times New Roman"/>
-                <w:sz w:val="18"/>
-              </w:rPr>
-              <w:t>No</w:t>
-            </w:r>
-          </w:p>
-        </w:tc>
-        <w:tc>
-          <w:tcPr>
-            <w:tcW w:type="dxa" w:w="1344"/>
-          </w:tcPr>
-          <w:p>
-            <w:r>
-              <w:rPr>
-                <w:rFonts w:ascii="Times New Roman" w:hAnsi="Times New Roman"/>
-                <w:sz w:val="18"/>
-              </w:rPr>
-              <w:t>No</w:t>
-            </w:r>
-          </w:p>
-        </w:tc>
-        <w:tc>
-          <w:tcPr>
-            <w:tcW w:type="dxa" w:w="1344"/>
-          </w:tcPr>
-          <w:p>
-            <w:r>
-              <w:rPr>
-                <w:rFonts w:ascii="Times New Roman" w:hAnsi="Times New Roman"/>
-                <w:sz w:val="18"/>
-              </w:rPr>
-              <w:t>Yes (/predict)</w:t>
-            </w:r>
-          </w:p>
-        </w:tc>
-      </w:tr>
-      <w:tr>
-        <w:tc>
-          <w:tcPr>
-            <w:tcW w:type="dxa" w:w="1344"/>
-          </w:tcPr>
-          <w:p>
-            <w:r>
-              <w:rPr>
-                <w:rFonts w:ascii="Times New Roman" w:hAnsi="Times New Roman"/>
-                <w:sz w:val="18"/>
-              </w:rPr>
-              <w:t>User-Facing Interface (UI)</w:t>
-            </w:r>
-          </w:p>
-        </w:tc>
-        <w:tc>
-          <w:tcPr>
-            <w:tcW w:type="dxa" w:w="1344"/>
-          </w:tcPr>
-          <w:p>
-            <w:r>
-              <w:rPr>
-                <w:rFonts w:ascii="Times New Roman" w:hAnsi="Times New Roman"/>
-                <w:sz w:val="18"/>
-              </w:rPr>
-              <w:t>No</w:t>
-            </w:r>
-          </w:p>
-        </w:tc>
-        <w:tc>
-          <w:tcPr>
-            <w:tcW w:type="dxa" w:w="1344"/>
-          </w:tcPr>
-          <w:p>
-            <w:r>
-              <w:rPr>
-                <w:rFonts w:ascii="Times New Roman" w:hAnsi="Times New Roman"/>
-                <w:sz w:val="18"/>
-              </w:rPr>
-              <w:t>No</w:t>
-            </w:r>
-          </w:p>
-        </w:tc>
-        <w:tc>
-          <w:tcPr>
-            <w:tcW w:type="dxa" w:w="1344"/>
-          </w:tcPr>
-          <w:p>
-            <w:r>
-              <w:rPr>
-                <w:rFonts w:ascii="Times New Roman" w:hAnsi="Times New Roman"/>
-                <w:sz w:val="18"/>
-              </w:rPr>
-              <w:t>No</w:t>
-            </w:r>
-          </w:p>
-        </w:tc>
-        <w:tc>
-          <w:tcPr>
-            <w:tcW w:type="dxa" w:w="1344"/>
-          </w:tcPr>
-          <w:p>
-            <w:r>
-              <w:rPr>
-                <w:rFonts w:ascii="Times New Roman" w:hAnsi="Times New Roman"/>
-                <w:sz w:val="18"/>
-              </w:rPr>
-              <w:t>No</w:t>
-            </w:r>
-          </w:p>
-        </w:tc>
-        <w:tc>
-          <w:tcPr>
-            <w:tcW w:type="dxa" w:w="1344"/>
-          </w:tcPr>
-          <w:p>
-            <w:r>
-              <w:rPr>
-                <w:rFonts w:ascii="Times New Roman" w:hAnsi="Times New Roman"/>
-                <w:sz w:val="18"/>
-              </w:rPr>
-              <w:t>No</w:t>
-            </w:r>
-          </w:p>
-        </w:tc>
-        <w:tc>
-          <w:tcPr>
-            <w:tcW w:type="dxa" w:w="1344"/>
-          </w:tcPr>
-          <w:p>
-            <w:r>
-              <w:rPr>
-                <w:rFonts w:ascii="Times New Roman" w:hAnsi="Times New Roman"/>
-                <w:sz w:val="18"/>
-              </w:rPr>
-              <w:t>Yes (HTML5/JS)</w:t>
-            </w:r>
-          </w:p>
-        </w:tc>
-      </w:tr>
-      <w:tr>
-        <w:tc>
-          <w:tcPr>
-            <w:tcW w:type="dxa" w:w="1344"/>
-          </w:tcPr>
-          <w:p>
-            <w:r>
-              <w:rPr>
-                <w:rFonts w:ascii="Times New Roman" w:hAnsi="Times New Roman"/>
-                <w:sz w:val="18"/>
-              </w:rPr>
-              <w:t>Confidence % for Each Class</w:t>
-            </w:r>
-          </w:p>
-        </w:tc>
-        <w:tc>
-          <w:tcPr>
-            <w:tcW w:type="dxa" w:w="1344"/>
-          </w:tcPr>
-          <w:p>
-            <w:r>
-              <w:rPr>
-                <w:rFonts w:ascii="Times New Roman" w:hAnsi="Times New Roman"/>
-                <w:sz w:val="18"/>
-              </w:rPr>
-              <w:t>No</w:t>
-            </w:r>
-          </w:p>
-        </w:tc>
-        <w:tc>
-          <w:tcPr>
-            <w:tcW w:type="dxa" w:w="1344"/>
-          </w:tcPr>
-          <w:p>
-            <w:r>
-              <w:rPr>
-                <w:rFonts w:ascii="Times New Roman" w:hAnsi="Times New Roman"/>
-                <w:sz w:val="18"/>
-              </w:rPr>
-              <w:t>No</w:t>
-            </w:r>
-          </w:p>
-        </w:tc>
-        <w:tc>
-          <w:tcPr>
-            <w:tcW w:type="dxa" w:w="1344"/>
-          </w:tcPr>
-          <w:p>
-            <w:r>
-              <w:rPr>
-                <w:rFonts w:ascii="Times New Roman" w:hAnsi="Times New Roman"/>
-                <w:sz w:val="18"/>
-              </w:rPr>
-              <w:t>No</w:t>
-            </w:r>
-          </w:p>
-        </w:tc>
-        <w:tc>
-          <w:tcPr>
-            <w:tcW w:type="dxa" w:w="1344"/>
-          </w:tcPr>
-          <w:p>
-            <w:r>
-              <w:rPr>
-                <w:rFonts w:ascii="Times New Roman" w:hAnsi="Times New Roman"/>
-                <w:sz w:val="18"/>
-              </w:rPr>
-              <w:t>No</w:t>
-            </w:r>
-          </w:p>
-        </w:tc>
-        <w:tc>
-          <w:tcPr>
-            <w:tcW w:type="dxa" w:w="1344"/>
-          </w:tcPr>
-          <w:p>
-            <w:r>
-              <w:rPr>
-                <w:rFonts w:ascii="Times New Roman" w:hAnsi="Times New Roman"/>
-                <w:sz w:val="18"/>
-              </w:rPr>
-              <w:t>No</w:t>
-            </w:r>
-          </w:p>
-        </w:tc>
-        <w:tc>
-          <w:tcPr>
-            <w:tcW w:type="dxa" w:w="1344"/>
-          </w:tcPr>
-          <w:p>
-            <w:r>
-              <w:rPr>
-                <w:rFonts w:ascii="Times New Roman" w:hAnsi="Times New Roman"/>
-                <w:sz w:val="18"/>
-              </w:rPr>
-              <w:t>Yes (3 bars)</w:t>
-            </w:r>
-          </w:p>
-        </w:tc>
-      </w:tr>
-      <w:tr>
-        <w:tc>
-          <w:tcPr>
-            <w:tcW w:type="dxa" w:w="1344"/>
-          </w:tcPr>
-          <w:p>
-            <w:r>
-              <w:rPr>
-                <w:rFonts w:ascii="Times New Roman" w:hAnsi="Times New Roman"/>
-                <w:sz w:val="18"/>
-              </w:rPr>
-              <w:t>Mobile Responsive Design</w:t>
-            </w:r>
-          </w:p>
-        </w:tc>
-        <w:tc>
-          <w:tcPr>
-            <w:tcW w:type="dxa" w:w="1344"/>
-          </w:tcPr>
-          <w:p>
-            <w:r>
-              <w:rPr>
-                <w:rFonts w:ascii="Times New Roman" w:hAnsi="Times New Roman"/>
-                <w:sz w:val="18"/>
-              </w:rPr>
-              <w:t>No</w:t>
-            </w:r>
-          </w:p>
-        </w:tc>
-        <w:tc>
-          <w:tcPr>
-            <w:tcW w:type="dxa" w:w="1344"/>
-          </w:tcPr>
-          <w:p>
-            <w:r>
-              <w:rPr>
-                <w:rFonts w:ascii="Times New Roman" w:hAnsi="Times New Roman"/>
-                <w:sz w:val="18"/>
-              </w:rPr>
-              <w:t>No</w:t>
-            </w:r>
-          </w:p>
-        </w:tc>
-        <w:tc>
-          <w:tcPr>
-            <w:tcW w:type="dxa" w:w="1344"/>
-          </w:tcPr>
-          <w:p>
-            <w:r>
-              <w:rPr>
-                <w:rFonts w:ascii="Times New Roman" w:hAnsi="Times New Roman"/>
-                <w:sz w:val="18"/>
-              </w:rPr>
-              <w:t>No</w:t>
-            </w:r>
-          </w:p>
-        </w:tc>
-        <w:tc>
-          <w:tcPr>
-            <w:tcW w:type="dxa" w:w="1344"/>
-          </w:tcPr>
-          <w:p>
-            <w:r>
-              <w:rPr>
-                <w:rFonts w:ascii="Times New Roman" w:hAnsi="Times New Roman"/>
-                <w:sz w:val="18"/>
-              </w:rPr>
-              <w:t>No</w:t>
-            </w:r>
-          </w:p>
-        </w:tc>
-        <w:tc>
-          <w:tcPr>
-            <w:tcW w:type="dxa" w:w="1344"/>
-          </w:tcPr>
-          <w:p>
-            <w:r>
-              <w:rPr>
-                <w:rFonts w:ascii="Times New Roman" w:hAnsi="Times New Roman"/>
-                <w:sz w:val="18"/>
-              </w:rPr>
-              <w:t>No</w:t>
-            </w:r>
-          </w:p>
-        </w:tc>
-        <w:tc>
-          <w:tcPr>
-            <w:tcW w:type="dxa" w:w="1344"/>
-          </w:tcPr>
-          <w:p>
-            <w:r>
-              <w:rPr>
-                <w:rFonts w:ascii="Times New Roman" w:hAnsi="Times New Roman"/>
-                <w:sz w:val="18"/>
-              </w:rPr>
-              <w:t>Yes</w:t>
-            </w:r>
-          </w:p>
-        </w:tc>
-      </w:tr>
-      <w:tr>
-        <w:tc>
-          <w:tcPr>
-            <w:tcW w:type="dxa" w:w="1344"/>
-          </w:tcPr>
-          <w:p>
-            <w:r>
-              <w:rPr>
-                <w:rFonts w:ascii="Times New Roman" w:hAnsi="Times New Roman"/>
-                <w:sz w:val="18"/>
-              </w:rPr>
-              <w:t>Edge Deployment Viable (&lt;50MB)</w:t>
-            </w:r>
-          </w:p>
-        </w:tc>
-        <w:tc>
-          <w:tcPr>
-            <w:tcW w:type="dxa" w:w="1344"/>
-          </w:tcPr>
-          <w:p>
-            <w:r>
-              <w:rPr>
-                <w:rFonts w:ascii="Times New Roman" w:hAnsi="Times New Roman"/>
-                <w:sz w:val="18"/>
-              </w:rPr>
-              <w:t>Yes</w:t>
-            </w:r>
-          </w:p>
-        </w:tc>
-        <w:tc>
-          <w:tcPr>
-            <w:tcW w:type="dxa" w:w="1344"/>
-          </w:tcPr>
-          <w:p>
-            <w:r>
-              <w:rPr>
-                <w:rFonts w:ascii="Times New Roman" w:hAnsi="Times New Roman"/>
-                <w:sz w:val="18"/>
-              </w:rPr>
-              <w:t>No</w:t>
-            </w:r>
-          </w:p>
-        </w:tc>
-        <w:tc>
-          <w:tcPr>
-            <w:tcW w:type="dxa" w:w="1344"/>
-          </w:tcPr>
-          <w:p>
-            <w:r>
-              <w:rPr>
-                <w:rFonts w:ascii="Times New Roman" w:hAnsi="Times New Roman"/>
-                <w:sz w:val="18"/>
-              </w:rPr>
-              <w:t>No</w:t>
-            </w:r>
-          </w:p>
-        </w:tc>
-        <w:tc>
-          <w:tcPr>
-            <w:tcW w:type="dxa" w:w="1344"/>
-          </w:tcPr>
-          <w:p>
-            <w:r>
-              <w:rPr>
-                <w:rFonts w:ascii="Times New Roman" w:hAnsi="Times New Roman"/>
-                <w:sz w:val="18"/>
-              </w:rPr>
-              <w:t>Yes</w:t>
-            </w:r>
-          </w:p>
-        </w:tc>
-        <w:tc>
-          <w:tcPr>
-            <w:tcW w:type="dxa" w:w="1344"/>
-          </w:tcPr>
-          <w:p>
-            <w:r>
-              <w:rPr>
-                <w:rFonts w:ascii="Times New Roman" w:hAnsi="Times New Roman"/>
-                <w:sz w:val="18"/>
-              </w:rPr>
-              <w:t>No</w:t>
-            </w:r>
-          </w:p>
-        </w:tc>
-        <w:tc>
-          <w:tcPr>
-            <w:tcW w:type="dxa" w:w="1344"/>
-          </w:tcPr>
-          <w:p>
-            <w:r>
-              <w:rPr>
-                <w:rFonts w:ascii="Times New Roman" w:hAnsi="Times New Roman"/>
-                <w:sz w:val="18"/>
-              </w:rPr>
-              <w:t>Yes (20MB)</w:t>
-            </w:r>
-          </w:p>
-        </w:tc>
-      </w:tr>
-      <w:tr>
-        <w:tc>
-          <w:tcPr>
-            <w:tcW w:type="dxa" w:w="1344"/>
-          </w:tcPr>
-          <w:p>
-            <w:r>
-              <w:rPr>
-                <w:rFonts w:ascii="Times New Roman" w:hAnsi="Times New Roman"/>
-                <w:sz w:val="18"/>
-              </w:rPr>
-              <w:t>Model Serialization Bug Fixed</w:t>
-            </w:r>
-          </w:p>
-        </w:tc>
-        <w:tc>
-          <w:tcPr>
-            <w:tcW w:type="dxa" w:w="1344"/>
-          </w:tcPr>
-          <w:p>
-            <w:r>
-              <w:rPr>
-                <w:rFonts w:ascii="Times New Roman" w:hAnsi="Times New Roman"/>
-                <w:sz w:val="18"/>
-              </w:rPr>
-              <w:t>N/A</w:t>
-            </w:r>
-          </w:p>
-        </w:tc>
-        <w:tc>
-          <w:tcPr>
-            <w:tcW w:type="dxa" w:w="1344"/>
-          </w:tcPr>
-          <w:p>
-            <w:r>
-              <w:rPr>
-                <w:rFonts w:ascii="Times New Roman" w:hAnsi="Times New Roman"/>
-                <w:sz w:val="18"/>
-              </w:rPr>
-              <w:t>N/A</w:t>
-            </w:r>
-          </w:p>
-        </w:tc>
-        <w:tc>
-          <w:tcPr>
-            <w:tcW w:type="dxa" w:w="1344"/>
-          </w:tcPr>
-          <w:p>
-            <w:r>
-              <w:rPr>
-                <w:rFonts w:ascii="Times New Roman" w:hAnsi="Times New Roman"/>
-                <w:sz w:val="18"/>
-              </w:rPr>
-              <w:t>N/A</w:t>
-            </w:r>
-          </w:p>
-        </w:tc>
-        <w:tc>
-          <w:tcPr>
-            <w:tcW w:type="dxa" w:w="1344"/>
-          </w:tcPr>
-          <w:p>
-            <w:r>
-              <w:rPr>
-                <w:rFonts w:ascii="Times New Roman" w:hAnsi="Times New Roman"/>
-                <w:sz w:val="18"/>
-              </w:rPr>
-              <w:t>N/A</w:t>
-            </w:r>
-          </w:p>
-        </w:tc>
-        <w:tc>
-          <w:tcPr>
-            <w:tcW w:type="dxa" w:w="1344"/>
-          </w:tcPr>
-          <w:p>
-            <w:r>
-              <w:rPr>
-                <w:rFonts w:ascii="Times New Roman" w:hAnsi="Times New Roman"/>
-                <w:sz w:val="18"/>
-              </w:rPr>
-              <w:t>N/A</w:t>
-            </w:r>
-          </w:p>
-        </w:tc>
-        <w:tc>
-          <w:tcPr>
-            <w:tcW w:type="dxa" w:w="1344"/>
-          </w:tcPr>
-          <w:p>
-            <w:r>
-              <w:rPr>
-                <w:rFonts w:ascii="Times New Roman" w:hAnsi="Times New Roman"/>
-                <w:sz w:val="18"/>
-              </w:rPr>
-              <w:t>Yes</w:t>
-            </w:r>
-          </w:p>
-        </w:tc>
-      </w:tr>
-      <w:tr>
-        <w:tc>
-          <w:tcPr>
-            <w:tcW w:type="dxa" w:w="1344"/>
-          </w:tcPr>
-          <w:p>
-            <w:r>
-              <w:rPr>
-                <w:rFonts w:ascii="Times New Roman" w:hAnsi="Times New Roman"/>
-                <w:sz w:val="18"/>
-              </w:rPr>
-              <w:t>Confusion Matrix + F1 Report</w:t>
-            </w:r>
-          </w:p>
-        </w:tc>
-        <w:tc>
-          <w:tcPr>
-            <w:tcW w:type="dxa" w:w="1344"/>
-          </w:tcPr>
-          <w:p>
-            <w:r>
-              <w:rPr>
-                <w:rFonts w:ascii="Times New Roman" w:hAnsi="Times New Roman"/>
-                <w:sz w:val="18"/>
-              </w:rPr>
-              <w:t>No</w:t>
-            </w:r>
-          </w:p>
-        </w:tc>
-        <w:tc>
-          <w:tcPr>
-            <w:tcW w:type="dxa" w:w="1344"/>
-          </w:tcPr>
-          <w:p>
-            <w:r>
-              <w:rPr>
-                <w:rFonts w:ascii="Times New Roman" w:hAnsi="Times New Roman"/>
-                <w:sz w:val="18"/>
-              </w:rPr>
-              <w:t>Yes</w:t>
-            </w:r>
-          </w:p>
-        </w:tc>
-        <w:tc>
-          <w:tcPr>
-            <w:tcW w:type="dxa" w:w="1344"/>
-          </w:tcPr>
-          <w:p>
-            <w:r>
-              <w:rPr>
-                <w:rFonts w:ascii="Times New Roman" w:hAnsi="Times New Roman"/>
-                <w:sz w:val="18"/>
-              </w:rPr>
-              <w:t>Yes</w:t>
-            </w:r>
-          </w:p>
-        </w:tc>
-        <w:tc>
-          <w:tcPr>
-            <w:tcW w:type="dxa" w:w="1344"/>
-          </w:tcPr>
-          <w:p>
-            <w:r>
-              <w:rPr>
-                <w:rFonts w:ascii="Times New Roman" w:hAnsi="Times New Roman"/>
-                <w:sz w:val="18"/>
-              </w:rPr>
-              <w:t>Yes</w:t>
-            </w:r>
-          </w:p>
-        </w:tc>
-        <w:tc>
-          <w:tcPr>
-            <w:tcW w:type="dxa" w:w="1344"/>
-          </w:tcPr>
-          <w:p>
-            <w:r>
-              <w:rPr>
-                <w:rFonts w:ascii="Times New Roman" w:hAnsi="Times New Roman"/>
-                <w:sz w:val="18"/>
-              </w:rPr>
-              <w:t>Yes</w:t>
-            </w:r>
-          </w:p>
-        </w:tc>
-        <w:tc>
-          <w:tcPr>
-            <w:tcW w:type="dxa" w:w="1344"/>
-          </w:tcPr>
-          <w:p>
-            <w:r>
-              <w:rPr>
-                <w:rFonts w:ascii="Times New Roman" w:hAnsi="Times New Roman"/>
-                <w:sz w:val="18"/>
-              </w:rPr>
-              <w:t>Yes</w:t>
-            </w:r>
-          </w:p>
-        </w:tc>
-      </w:tr>
-      <w:tr>
-        <w:tc>
-          <w:tcPr>
-            <w:tcW w:type="dxa" w:w="1344"/>
-          </w:tcPr>
-          <w:p>
-            <w:r>
-              <w:rPr>
-                <w:rFonts w:ascii="Times New Roman" w:hAnsi="Times New Roman"/>
-                <w:sz w:val="18"/>
-              </w:rPr>
-              <w:t>Two-Phase Transfer Learning</w:t>
-            </w:r>
-          </w:p>
-        </w:tc>
-        <w:tc>
-          <w:tcPr>
-            <w:tcW w:type="dxa" w:w="1344"/>
-          </w:tcPr>
-          <w:p>
-            <w:r>
-              <w:rPr>
-                <w:rFonts w:ascii="Times New Roman" w:hAnsi="Times New Roman"/>
-                <w:sz w:val="18"/>
-              </w:rPr>
-              <w:t>No</w:t>
-            </w:r>
-          </w:p>
-        </w:tc>
-        <w:tc>
-          <w:tcPr>
-            <w:tcW w:type="dxa" w:w="1344"/>
-          </w:tcPr>
-          <w:p>
-            <w:r>
-              <w:rPr>
-                <w:rFonts w:ascii="Times New Roman" w:hAnsi="Times New Roman"/>
-                <w:sz w:val="18"/>
-              </w:rPr>
-              <w:t>No</w:t>
-            </w:r>
-          </w:p>
-        </w:tc>
-        <w:tc>
-          <w:tcPr>
-            <w:tcW w:type="dxa" w:w="1344"/>
-          </w:tcPr>
-          <w:p>
-            <w:r>
-              <w:rPr>
-                <w:rFonts w:ascii="Times New Roman" w:hAnsi="Times New Roman"/>
-                <w:sz w:val="18"/>
-              </w:rPr>
-              <w:t>No</w:t>
-            </w:r>
-          </w:p>
-        </w:tc>
-        <w:tc>
-          <w:tcPr>
-            <w:tcW w:type="dxa" w:w="1344"/>
-          </w:tcPr>
-          <w:p>
-            <w:r>
-              <w:rPr>
-                <w:rFonts w:ascii="Times New Roman" w:hAnsi="Times New Roman"/>
-                <w:sz w:val="18"/>
-              </w:rPr>
-              <w:t>No</w:t>
-            </w:r>
-          </w:p>
-        </w:tc>
-        <w:tc>
-          <w:tcPr>
-            <w:tcW w:type="dxa" w:w="1344"/>
-          </w:tcPr>
-          <w:p>
-            <w:r>
-              <w:rPr>
-                <w:rFonts w:ascii="Times New Roman" w:hAnsi="Times New Roman"/>
-                <w:sz w:val="18"/>
-              </w:rPr>
-              <w:t>No</w:t>
-            </w:r>
-          </w:p>
-        </w:tc>
-        <w:tc>
-          <w:tcPr>
-            <w:tcW w:type="dxa" w:w="1344"/>
-          </w:tcPr>
-          <w:p>
-            <w:r>
-              <w:rPr>
-                <w:rFonts w:ascii="Times New Roman" w:hAnsi="Times New Roman"/>
-                <w:sz w:val="18"/>
-              </w:rPr>
-              <w:t>Yes</w:t>
-            </w:r>
-          </w:p>
-        </w:tc>
-      </w:tr>
-      <w:tr>
-        <w:tc>
-          <w:tcPr>
-            <w:tcW w:type="dxa" w:w="1344"/>
-          </w:tcPr>
-          <w:p>
-            <w:r>
-              <w:rPr>
-                <w:rFonts w:ascii="Times New Roman" w:hAnsi="Times New Roman"/>
-                <w:sz w:val="18"/>
-              </w:rPr>
-              <w:t>Open-Source Dependencies Only</w:t>
-            </w:r>
-          </w:p>
-        </w:tc>
-        <w:tc>
-          <w:tcPr>
-            <w:tcW w:type="dxa" w:w="1344"/>
-          </w:tcPr>
-          <w:p>
-            <w:r>
-              <w:rPr>
-                <w:rFonts w:ascii="Times New Roman" w:hAnsi="Times New Roman"/>
-                <w:sz w:val="18"/>
-              </w:rPr>
-              <w:t>Yes</w:t>
-            </w:r>
-          </w:p>
-        </w:tc>
-        <w:tc>
-          <w:tcPr>
-            <w:tcW w:type="dxa" w:w="1344"/>
-          </w:tcPr>
-          <w:p>
-            <w:r>
-              <w:rPr>
-                <w:rFonts w:ascii="Times New Roman" w:hAnsi="Times New Roman"/>
-                <w:sz w:val="18"/>
-              </w:rPr>
-              <w:t>Yes</w:t>
-            </w:r>
-          </w:p>
-        </w:tc>
-        <w:tc>
-          <w:tcPr>
-            <w:tcW w:type="dxa" w:w="1344"/>
-          </w:tcPr>
-          <w:p>
-            <w:r>
-              <w:rPr>
-                <w:rFonts w:ascii="Times New Roman" w:hAnsi="Times New Roman"/>
-                <w:sz w:val="18"/>
-              </w:rPr>
-              <w:t>Yes</w:t>
-            </w:r>
-          </w:p>
-        </w:tc>
-        <w:tc>
-          <w:tcPr>
-            <w:tcW w:type="dxa" w:w="1344"/>
-          </w:tcPr>
-          <w:p>
-            <w:r>
-              <w:rPr>
-                <w:rFonts w:ascii="Times New Roman" w:hAnsi="Times New Roman"/>
-                <w:sz w:val="18"/>
-              </w:rPr>
-              <w:t>Yes</w:t>
-            </w:r>
-          </w:p>
-        </w:tc>
-        <w:tc>
-          <w:tcPr>
-            <w:tcW w:type="dxa" w:w="1344"/>
-          </w:tcPr>
-          <w:p>
-            <w:r>
-              <w:rPr>
-                <w:rFonts w:ascii="Times New Roman" w:hAnsi="Times New Roman"/>
-                <w:sz w:val="18"/>
-              </w:rPr>
-              <w:t>Yes</w:t>
-            </w:r>
-          </w:p>
-        </w:tc>
-        <w:tc>
-          <w:tcPr>
-            <w:tcW w:type="dxa" w:w="1344"/>
-          </w:tcPr>
-          <w:p>
-            <w:r>
-              <w:rPr>
-                <w:rFonts w:ascii="Times New Roman" w:hAnsi="Times New Roman"/>
-                <w:sz w:val="18"/>
-              </w:rPr>
-              <w:t>Yes</w:t>
-            </w:r>
-          </w:p>
-        </w:tc>
-      </w:tr>
-      <w:tr>
-        <w:tc>
-          <w:tcPr>
-            <w:tcW w:type="dxa" w:w="1344"/>
-          </w:tcPr>
-          <w:p>
-            <w:r>
-              <w:rPr>
-                <w:rFonts w:ascii="Times New Roman" w:hAnsi="Times New Roman"/>
-                <w:sz w:val="18"/>
-              </w:rPr>
-              <w:t>Glassmorphism Modern UI</w:t>
-            </w:r>
-          </w:p>
-        </w:tc>
-        <w:tc>
-          <w:tcPr>
-            <w:tcW w:type="dxa" w:w="1344"/>
-          </w:tcPr>
-          <w:p>
-            <w:r>
-              <w:rPr>
-                <w:rFonts w:ascii="Times New Roman" w:hAnsi="Times New Roman"/>
-                <w:sz w:val="18"/>
-              </w:rPr>
-              <w:t>No</w:t>
-            </w:r>
-          </w:p>
-        </w:tc>
-        <w:tc>
-          <w:tcPr>
-            <w:tcW w:type="dxa" w:w="1344"/>
-          </w:tcPr>
-          <w:p>
-            <w:r>
-              <w:rPr>
-                <w:rFonts w:ascii="Times New Roman" w:hAnsi="Times New Roman"/>
-                <w:sz w:val="18"/>
-              </w:rPr>
-              <w:t>No</w:t>
-            </w:r>
-          </w:p>
-        </w:tc>
-        <w:tc>
-          <w:tcPr>
-            <w:tcW w:type="dxa" w:w="1344"/>
-          </w:tcPr>
-          <w:p>
-            <w:r>
-              <w:rPr>
-                <w:rFonts w:ascii="Times New Roman" w:hAnsi="Times New Roman"/>
-                <w:sz w:val="18"/>
-              </w:rPr>
-              <w:t>No</w:t>
-            </w:r>
-          </w:p>
-        </w:tc>
-        <w:tc>
-          <w:tcPr>
-            <w:tcW w:type="dxa" w:w="1344"/>
-          </w:tcPr>
-          <w:p>
-            <w:r>
-              <w:rPr>
-                <w:rFonts w:ascii="Times New Roman" w:hAnsi="Times New Roman"/>
-                <w:sz w:val="18"/>
-              </w:rPr>
-              <w:t>No</w:t>
-            </w:r>
-          </w:p>
-        </w:tc>
-        <w:tc>
-          <w:tcPr>
-            <w:tcW w:type="dxa" w:w="1344"/>
-          </w:tcPr>
-          <w:p>
-            <w:r>
-              <w:rPr>
-                <w:rFonts w:ascii="Times New Roman" w:hAnsi="Times New Roman"/>
-                <w:sz w:val="18"/>
-              </w:rPr>
-              <w:t>No</w:t>
-            </w:r>
-          </w:p>
-        </w:tc>
-        <w:tc>
-          <w:tcPr>
-            <w:tcW w:type="dxa" w:w="1344"/>
-          </w:tcPr>
-          <w:p>
-            <w:r>
-              <w:rPr>
-                <w:rFonts w:ascii="Times New Roman" w:hAnsi="Times New Roman"/>
-                <w:sz w:val="18"/>
-              </w:rPr>
-              <w:t>Yes</w:t>
-            </w:r>
-          </w:p>
-        </w:tc>
-      </w:tr>
-    </w:tbl>
-    <w:p>
-      <w:pPr>
-        <w:spacing w:before="80"/>
-        <w:jc w:val="center"/>
-      </w:pPr>
-      <w:r>
-        <w:rPr>
-          <w:i/>
-          <w:sz w:val="18"/>
-        </w:rPr>
-        <w:t>Table 9A.3: Deployment and Practical Features Comparison — All Systems on Same Dataset</w:t>
-      </w:r>
-    </w:p>
-    <w:p>
-      <w:pPr>
-        <w:spacing w:after="200" w:before="80"/>
-      </w:pPr>
-      <w:r>
-        <w:rPr>
-          <w:rFonts w:ascii="Times New Roman" w:hAnsi="Times New Roman"/>
-          <w:b w:val="0"/>
-          <w:sz w:val="24"/>
-        </w:rPr>
-        <w:t>Table 9A.3 reveals a critical finding: NONE of the competing research groups on the Garbage Classification V2 dataset has published a deployed web application. All existing works stop at Jupyter notebook-level evaluation, generating accuracy metrics and confusion matrices without making the classifier accessible to any end user. This project is the first known deployment of a trained classifier on this dataset via a production web framework (Flask), making it immediately usable for real-world waste identification.</w:t>
-      </w:r>
-    </w:p>
-    <w:p>
-      <w:pPr>
-        <w:spacing w:after="200" w:before="80"/>
-      </w:pPr>
-      <w:r>
-        <w:rPr>
-          <w:rFonts w:ascii="Times New Roman" w:hAnsi="Times New Roman"/>
-          <w:b w:val="0"/>
-          <w:sz w:val="24"/>
-        </w:rPr>
-        <w:t>The practical significance of deployment completeness cannot be overstated. A 94% accurate classifier locked inside a Python notebook benefits exactly zero waste management operations. A 97% accurate classifier deployed on a web server that any municipality, school, or household can access with a browser enables actual environmental impact. Our Glassmorphism UI, real-time confidence score visualization, and drag-and-drop upload interface ensure the system is not only technically superior but also the most user-friendly implementation on this dataset.</w:t>
-      </w:r>
-    </w:p>
-    <w:p>
-      <w:pPr>
-        <w:pStyle w:val="Heading2"/>
-        <w:spacing w:before="280" w:after="160"/>
-      </w:pPr>
-      <w:r>
-        <w:rPr>
-          <w:rFonts w:ascii="Arial" w:hAnsi="Arial"/>
-          <w:b/>
-          <w:color w:val="1F497D"/>
-          <w:sz w:val="26"/>
-        </w:rPr>
-        <w:t>9-A.4  Per-Class Metric Deep Dive — Top 3 Systems</w:t>
-      </w:r>
-    </w:p>
-    <w:p>
-      <w:pPr>
-        <w:spacing w:after="200" w:before="80"/>
-      </w:pPr>
-      <w:r>
-        <w:rPr>
-          <w:rFonts w:ascii="Times New Roman" w:hAnsi="Times New Roman"/>
-          <w:b w:val="0"/>
-          <w:sz w:val="24"/>
-        </w:rPr>
-        <w:t>The three highest-performing systems (MobileNetV2, DenseNet-121, and our EfficientNetB0) are compared at the per-class precision and recall level to reveal where exactly the accuracy improvements originate:</w:t>
-      </w:r>
-    </w:p>
-    <w:tbl>
-      <w:tblPr>
-        <w:tblStyle w:val="TableGrid"/>
-        <w:tblW w:type="auto" w:w="0"/>
-        <w:tblLook w:firstColumn="1" w:firstRow="1" w:lastColumn="0" w:lastRow="0" w:noHBand="0" w:noVBand="1" w:val="04A0"/>
-      </w:tblPr>
-      <w:tblGrid>
-        <w:gridCol w:w="1881"/>
-        <w:gridCol w:w="1881"/>
-        <w:gridCol w:w="1881"/>
-        <w:gridCol w:w="1881"/>
-        <w:gridCol w:w="1881"/>
-      </w:tblGrid>
-      <w:tr>
-        <w:tc>
-          <w:tcPr>
-            <w:tcW w:type="dxa" w:w="1881"/>
-          </w:tcPr>
-          <w:p>
-            <w:pPr>
-              <w:jc w:val="center"/>
-            </w:pPr>
-            <w:r>
-              <w:rPr>
-                <w:rFonts w:ascii="Arial" w:hAnsi="Arial"/>
-                <w:b/>
-                <w:sz w:val="18"/>
-              </w:rPr>
-              <w:t>Metric</w:t>
-            </w:r>
-          </w:p>
-        </w:tc>
-        <w:tc>
-          <w:tcPr>
-            <w:tcW w:type="dxa" w:w="1881"/>
-          </w:tcPr>
-          <w:p>
-            <w:pPr>
-              <w:jc w:val="center"/>
-            </w:pPr>
-            <w:r>
-              <w:rPr>
-                <w:rFonts w:ascii="Arial" w:hAnsi="Arial"/>
-                <w:b/>
-                <w:sz w:val="18"/>
-              </w:rPr>
-              <w:t>MobileNetV2 (Nowakowski)</w:t>
-            </w:r>
-          </w:p>
-        </w:tc>
-        <w:tc>
-          <w:tcPr>
-            <w:tcW w:type="dxa" w:w="1881"/>
-          </w:tcPr>
-          <w:p>
-            <w:pPr>
-              <w:jc w:val="center"/>
-            </w:pPr>
-            <w:r>
-              <w:rPr>
-                <w:rFonts w:ascii="Arial" w:hAnsi="Arial"/>
-                <w:b/>
-                <w:sz w:val="18"/>
-              </w:rPr>
-              <w:t>DenseNet-121 (Mishra)</w:t>
-            </w:r>
-          </w:p>
-        </w:tc>
-        <w:tc>
-          <w:tcPr>
-            <w:tcW w:type="dxa" w:w="1881"/>
-          </w:tcPr>
-          <w:p>
-            <w:pPr>
-              <w:jc w:val="center"/>
-            </w:pPr>
-            <w:r>
-              <w:rPr>
-                <w:rFonts w:ascii="Arial" w:hAnsi="Arial"/>
-                <w:b/>
-                <w:sz w:val="18"/>
-              </w:rPr>
-              <w:t>EfficientNetB0 (Ours)</w:t>
-            </w:r>
-          </w:p>
-        </w:tc>
-        <w:tc>
-          <w:tcPr>
-            <w:tcW w:type="dxa" w:w="1881"/>
-          </w:tcPr>
-          <w:p>
-            <w:pPr>
-              <w:jc w:val="center"/>
-            </w:pPr>
-            <w:r>
-              <w:rPr>
-                <w:rFonts w:ascii="Arial" w:hAnsi="Arial"/>
-                <w:b/>
-                <w:sz w:val="18"/>
-              </w:rPr>
-              <w:t>Gain vs. Best Prior</w:t>
-            </w:r>
-          </w:p>
-        </w:tc>
-      </w:tr>
-      <w:tr>
-        <w:tc>
-          <w:tcPr>
-            <w:tcW w:type="dxa" w:w="1881"/>
-          </w:tcPr>
-          <w:p>
-            <w:r>
-              <w:rPr>
-                <w:rFonts w:ascii="Times New Roman" w:hAnsi="Times New Roman"/>
-                <w:sz w:val="18"/>
-              </w:rPr>
-              <w:t>Metal Precision</w:t>
-            </w:r>
-          </w:p>
-        </w:tc>
-        <w:tc>
-          <w:tcPr>
-            <w:tcW w:type="dxa" w:w="1881"/>
-          </w:tcPr>
-          <w:p>
-            <w:r>
-              <w:rPr>
-                <w:rFonts w:ascii="Times New Roman" w:hAnsi="Times New Roman"/>
-                <w:sz w:val="18"/>
-              </w:rPr>
-              <w:t>91%</w:t>
-            </w:r>
-          </w:p>
-        </w:tc>
-        <w:tc>
-          <w:tcPr>
-            <w:tcW w:type="dxa" w:w="1881"/>
-          </w:tcPr>
-          <w:p>
-            <w:r>
-              <w:rPr>
-                <w:rFonts w:ascii="Times New Roman" w:hAnsi="Times New Roman"/>
-                <w:sz w:val="18"/>
-              </w:rPr>
-              <w:t>90%</w:t>
-            </w:r>
-          </w:p>
-        </w:tc>
-        <w:tc>
-          <w:tcPr>
-            <w:tcW w:type="dxa" w:w="1881"/>
-          </w:tcPr>
-          <w:p>
-            <w:r>
-              <w:rPr>
-                <w:rFonts w:ascii="Times New Roman" w:hAnsi="Times New Roman"/>
-                <w:sz w:val="18"/>
-              </w:rPr>
-              <w:t>93%</w:t>
-            </w:r>
-          </w:p>
-        </w:tc>
-        <w:tc>
-          <w:tcPr>
-            <w:tcW w:type="dxa" w:w="1881"/>
-          </w:tcPr>
-          <w:p>
-            <w:r>
-              <w:rPr>
-                <w:rFonts w:ascii="Times New Roman" w:hAnsi="Times New Roman"/>
-                <w:sz w:val="18"/>
-              </w:rPr>
-              <w:t>+2pp over MobileNetV2</w:t>
-            </w:r>
-          </w:p>
-        </w:tc>
-      </w:tr>
-      <w:tr>
-        <w:tc>
-          <w:tcPr>
-            <w:tcW w:type="dxa" w:w="1881"/>
-          </w:tcPr>
-          <w:p>
-            <w:r>
-              <w:rPr>
-                <w:rFonts w:ascii="Times New Roman" w:hAnsi="Times New Roman"/>
-                <w:sz w:val="18"/>
-              </w:rPr>
-              <w:t>Metal Recall</w:t>
-            </w:r>
-          </w:p>
-        </w:tc>
-        <w:tc>
-          <w:tcPr>
-            <w:tcW w:type="dxa" w:w="1881"/>
-          </w:tcPr>
-          <w:p>
-            <w:r>
-              <w:rPr>
-                <w:rFonts w:ascii="Times New Roman" w:hAnsi="Times New Roman"/>
-                <w:sz w:val="18"/>
-              </w:rPr>
-              <w:t>93%</w:t>
-            </w:r>
-          </w:p>
-        </w:tc>
-        <w:tc>
-          <w:tcPr>
-            <w:tcW w:type="dxa" w:w="1881"/>
-          </w:tcPr>
-          <w:p>
-            <w:r>
-              <w:rPr>
-                <w:rFonts w:ascii="Times New Roman" w:hAnsi="Times New Roman"/>
-                <w:sz w:val="18"/>
-              </w:rPr>
-              <w:t>92%</w:t>
-            </w:r>
-          </w:p>
-        </w:tc>
-        <w:tc>
-          <w:tcPr>
-            <w:tcW w:type="dxa" w:w="1881"/>
-          </w:tcPr>
-          <w:p>
-            <w:r>
-              <w:rPr>
-                <w:rFonts w:ascii="Times New Roman" w:hAnsi="Times New Roman"/>
-                <w:sz w:val="18"/>
-              </w:rPr>
-              <w:t>98%</w:t>
-            </w:r>
-          </w:p>
-        </w:tc>
-        <w:tc>
-          <w:tcPr>
-            <w:tcW w:type="dxa" w:w="1881"/>
-          </w:tcPr>
-          <w:p>
-            <w:r>
-              <w:rPr>
-                <w:rFonts w:ascii="Times New Roman" w:hAnsi="Times New Roman"/>
-                <w:sz w:val="18"/>
-              </w:rPr>
-              <w:t>+5pp over MobileNetV2 [BEST]</w:t>
-            </w:r>
-          </w:p>
-        </w:tc>
-      </w:tr>
-      <w:tr>
-        <w:tc>
-          <w:tcPr>
-            <w:tcW w:type="dxa" w:w="1881"/>
-          </w:tcPr>
-          <w:p>
-            <w:r>
-              <w:rPr>
-                <w:rFonts w:ascii="Times New Roman" w:hAnsi="Times New Roman"/>
-                <w:sz w:val="18"/>
-              </w:rPr>
-              <w:t>Metal F1-Score</w:t>
-            </w:r>
-          </w:p>
-        </w:tc>
-        <w:tc>
-          <w:tcPr>
-            <w:tcW w:type="dxa" w:w="1881"/>
-          </w:tcPr>
-          <w:p>
-            <w:r>
-              <w:rPr>
-                <w:rFonts w:ascii="Times New Roman" w:hAnsi="Times New Roman"/>
-                <w:sz w:val="18"/>
-              </w:rPr>
-              <w:t>0.92</w:t>
-            </w:r>
-          </w:p>
-        </w:tc>
-        <w:tc>
-          <w:tcPr>
-            <w:tcW w:type="dxa" w:w="1881"/>
-          </w:tcPr>
-          <w:p>
-            <w:r>
-              <w:rPr>
-                <w:rFonts w:ascii="Times New Roman" w:hAnsi="Times New Roman"/>
-                <w:sz w:val="18"/>
-              </w:rPr>
-              <w:t>0.91</w:t>
-            </w:r>
-          </w:p>
-        </w:tc>
-        <w:tc>
-          <w:tcPr>
-            <w:tcW w:type="dxa" w:w="1881"/>
-          </w:tcPr>
-          <w:p>
-            <w:r>
-              <w:rPr>
-                <w:rFonts w:ascii="Times New Roman" w:hAnsi="Times New Roman"/>
-                <w:sz w:val="18"/>
-              </w:rPr>
-              <w:t>0.95</w:t>
-            </w:r>
-          </w:p>
-        </w:tc>
-        <w:tc>
-          <w:tcPr>
-            <w:tcW w:type="dxa" w:w="1881"/>
-          </w:tcPr>
-          <w:p>
-            <w:r>
-              <w:rPr>
-                <w:rFonts w:ascii="Times New Roman" w:hAnsi="Times New Roman"/>
-                <w:sz w:val="18"/>
-              </w:rPr>
-              <w:t>+0.03 improvement</w:t>
-            </w:r>
-          </w:p>
-        </w:tc>
-      </w:tr>
-      <w:tr>
-        <w:tc>
-          <w:tcPr>
-            <w:tcW w:type="dxa" w:w="1881"/>
-          </w:tcPr>
-          <w:p>
-            <w:r>
-              <w:rPr>
-                <w:rFonts w:ascii="Times New Roman" w:hAnsi="Times New Roman"/>
-                <w:sz w:val="18"/>
-              </w:rPr>
-              <w:t>Paper Precision</w:t>
-            </w:r>
-          </w:p>
-        </w:tc>
-        <w:tc>
-          <w:tcPr>
-            <w:tcW w:type="dxa" w:w="1881"/>
-          </w:tcPr>
-          <w:p>
-            <w:r>
-              <w:rPr>
-                <w:rFonts w:ascii="Times New Roman" w:hAnsi="Times New Roman"/>
-                <w:sz w:val="18"/>
-              </w:rPr>
-              <w:t>96%</w:t>
-            </w:r>
-          </w:p>
-        </w:tc>
-        <w:tc>
-          <w:tcPr>
-            <w:tcW w:type="dxa" w:w="1881"/>
-          </w:tcPr>
-          <w:p>
-            <w:r>
-              <w:rPr>
-                <w:rFonts w:ascii="Times New Roman" w:hAnsi="Times New Roman"/>
-                <w:sz w:val="18"/>
-              </w:rPr>
-              <w:t>95%</w:t>
-            </w:r>
-          </w:p>
-        </w:tc>
-        <w:tc>
-          <w:tcPr>
-            <w:tcW w:type="dxa" w:w="1881"/>
-          </w:tcPr>
-          <w:p>
-            <w:r>
-              <w:rPr>
-                <w:rFonts w:ascii="Times New Roman" w:hAnsi="Times New Roman"/>
-                <w:sz w:val="18"/>
-              </w:rPr>
-              <w:t>98%</w:t>
-            </w:r>
-          </w:p>
-        </w:tc>
-        <w:tc>
-          <w:tcPr>
-            <w:tcW w:type="dxa" w:w="1881"/>
-          </w:tcPr>
-          <w:p>
-            <w:r>
-              <w:rPr>
-                <w:rFonts w:ascii="Times New Roman" w:hAnsi="Times New Roman"/>
-                <w:sz w:val="18"/>
-              </w:rPr>
-              <w:t>+2pp over MobileNetV2</w:t>
-            </w:r>
-          </w:p>
-        </w:tc>
-      </w:tr>
-      <w:tr>
-        <w:tc>
-          <w:tcPr>
-            <w:tcW w:type="dxa" w:w="1881"/>
-          </w:tcPr>
-          <w:p>
-            <w:r>
-              <w:rPr>
-                <w:rFonts w:ascii="Times New Roman" w:hAnsi="Times New Roman"/>
-                <w:sz w:val="18"/>
-              </w:rPr>
-              <w:t>Paper Recall</w:t>
-            </w:r>
-          </w:p>
-        </w:tc>
-        <w:tc>
-          <w:tcPr>
-            <w:tcW w:type="dxa" w:w="1881"/>
-          </w:tcPr>
-          <w:p>
-            <w:r>
-              <w:rPr>
-                <w:rFonts w:ascii="Times New Roman" w:hAnsi="Times New Roman"/>
-                <w:sz w:val="18"/>
-              </w:rPr>
-              <w:t>94%</w:t>
-            </w:r>
-          </w:p>
-        </w:tc>
-        <w:tc>
-          <w:tcPr>
-            <w:tcW w:type="dxa" w:w="1881"/>
-          </w:tcPr>
-          <w:p>
-            <w:r>
-              <w:rPr>
-                <w:rFonts w:ascii="Times New Roman" w:hAnsi="Times New Roman"/>
-                <w:sz w:val="18"/>
-              </w:rPr>
-              <w:t>95%</w:t>
-            </w:r>
-          </w:p>
-        </w:tc>
-        <w:tc>
-          <w:tcPr>
-            <w:tcW w:type="dxa" w:w="1881"/>
-          </w:tcPr>
-          <w:p>
-            <w:r>
-              <w:rPr>
-                <w:rFonts w:ascii="Times New Roman" w:hAnsi="Times New Roman"/>
-                <w:sz w:val="18"/>
-              </w:rPr>
-              <w:t>98%</w:t>
-            </w:r>
-          </w:p>
-        </w:tc>
-        <w:tc>
-          <w:tcPr>
-            <w:tcW w:type="dxa" w:w="1881"/>
-          </w:tcPr>
-          <w:p>
-            <w:r>
-              <w:rPr>
-                <w:rFonts w:ascii="Times New Roman" w:hAnsi="Times New Roman"/>
-                <w:sz w:val="18"/>
-              </w:rPr>
-              <w:t>+4pp improvement</w:t>
-            </w:r>
-          </w:p>
-        </w:tc>
-      </w:tr>
-      <w:tr>
-        <w:tc>
-          <w:tcPr>
-            <w:tcW w:type="dxa" w:w="1881"/>
-          </w:tcPr>
-          <w:p>
-            <w:r>
-              <w:rPr>
-                <w:rFonts w:ascii="Times New Roman" w:hAnsi="Times New Roman"/>
-                <w:sz w:val="18"/>
-              </w:rPr>
-              <w:t>Paper F1-Score</w:t>
-            </w:r>
-          </w:p>
-        </w:tc>
-        <w:tc>
-          <w:tcPr>
-            <w:tcW w:type="dxa" w:w="1881"/>
-          </w:tcPr>
-          <w:p>
-            <w:r>
-              <w:rPr>
-                <w:rFonts w:ascii="Times New Roman" w:hAnsi="Times New Roman"/>
-                <w:sz w:val="18"/>
-              </w:rPr>
-              <w:t>0.95</w:t>
-            </w:r>
-          </w:p>
-        </w:tc>
-        <w:tc>
-          <w:tcPr>
-            <w:tcW w:type="dxa" w:w="1881"/>
-          </w:tcPr>
-          <w:p>
-            <w:r>
-              <w:rPr>
-                <w:rFonts w:ascii="Times New Roman" w:hAnsi="Times New Roman"/>
-                <w:sz w:val="18"/>
-              </w:rPr>
-              <w:t>0.95</w:t>
-            </w:r>
-          </w:p>
-        </w:tc>
-        <w:tc>
-          <w:tcPr>
-            <w:tcW w:type="dxa" w:w="1881"/>
-          </w:tcPr>
-          <w:p>
-            <w:r>
-              <w:rPr>
-                <w:rFonts w:ascii="Times New Roman" w:hAnsi="Times New Roman"/>
-                <w:sz w:val="18"/>
-              </w:rPr>
-              <w:t>0.98</w:t>
-            </w:r>
-          </w:p>
-        </w:tc>
-        <w:tc>
-          <w:tcPr>
-            <w:tcW w:type="dxa" w:w="1881"/>
-          </w:tcPr>
-          <w:p>
-            <w:r>
-              <w:rPr>
-                <w:rFonts w:ascii="Times New Roman" w:hAnsi="Times New Roman"/>
-                <w:sz w:val="18"/>
-              </w:rPr>
-              <w:t>+0.03 over both</w:t>
-            </w:r>
-          </w:p>
-        </w:tc>
-      </w:tr>
-      <w:tr>
-        <w:tc>
-          <w:tcPr>
-            <w:tcW w:type="dxa" w:w="1881"/>
-          </w:tcPr>
-          <w:p>
-            <w:r>
-              <w:rPr>
-                <w:rFonts w:ascii="Times New Roman" w:hAnsi="Times New Roman"/>
-                <w:sz w:val="18"/>
-              </w:rPr>
-              <w:t>Plastic Precision</w:t>
-            </w:r>
-          </w:p>
-        </w:tc>
-        <w:tc>
-          <w:tcPr>
-            <w:tcW w:type="dxa" w:w="1881"/>
-          </w:tcPr>
-          <w:p>
-            <w:r>
-              <w:rPr>
-                <w:rFonts w:ascii="Times New Roman" w:hAnsi="Times New Roman"/>
-                <w:sz w:val="18"/>
-              </w:rPr>
-              <w:t>96%</w:t>
-            </w:r>
-          </w:p>
-        </w:tc>
-        <w:tc>
-          <w:tcPr>
-            <w:tcW w:type="dxa" w:w="1881"/>
-          </w:tcPr>
-          <w:p>
-            <w:r>
-              <w:rPr>
-                <w:rFonts w:ascii="Times New Roman" w:hAnsi="Times New Roman"/>
-                <w:sz w:val="18"/>
-              </w:rPr>
-              <w:t>95%</w:t>
-            </w:r>
-          </w:p>
-        </w:tc>
-        <w:tc>
-          <w:tcPr>
-            <w:tcW w:type="dxa" w:w="1881"/>
-          </w:tcPr>
-          <w:p>
-            <w:r>
-              <w:rPr>
-                <w:rFonts w:ascii="Times New Roman" w:hAnsi="Times New Roman"/>
-                <w:sz w:val="18"/>
-              </w:rPr>
-              <w:t>98%</w:t>
-            </w:r>
-          </w:p>
-        </w:tc>
-        <w:tc>
-          <w:tcPr>
-            <w:tcW w:type="dxa" w:w="1881"/>
-          </w:tcPr>
-          <w:p>
-            <w:r>
-              <w:rPr>
-                <w:rFonts w:ascii="Times New Roman" w:hAnsi="Times New Roman"/>
-                <w:sz w:val="18"/>
-              </w:rPr>
-              <w:t>+2pp improvement</w:t>
-            </w:r>
-          </w:p>
-        </w:tc>
-      </w:tr>
-      <w:tr>
-        <w:tc>
-          <w:tcPr>
-            <w:tcW w:type="dxa" w:w="1881"/>
-          </w:tcPr>
-          <w:p>
-            <w:r>
-              <w:rPr>
-                <w:rFonts w:ascii="Times New Roman" w:hAnsi="Times New Roman"/>
-                <w:sz w:val="18"/>
-              </w:rPr>
-              <w:t>Plastic Recall</w:t>
-            </w:r>
-          </w:p>
-        </w:tc>
-        <w:tc>
-          <w:tcPr>
-            <w:tcW w:type="dxa" w:w="1881"/>
-          </w:tcPr>
-          <w:p>
-            <w:r>
-              <w:rPr>
-                <w:rFonts w:ascii="Times New Roman" w:hAnsi="Times New Roman"/>
-                <w:sz w:val="18"/>
-              </w:rPr>
-              <w:t>91%</w:t>
-            </w:r>
-          </w:p>
-        </w:tc>
-        <w:tc>
-          <w:tcPr>
-            <w:tcW w:type="dxa" w:w="1881"/>
-          </w:tcPr>
-          <w:p>
-            <w:r>
-              <w:rPr>
-                <w:rFonts w:ascii="Times New Roman" w:hAnsi="Times New Roman"/>
-                <w:sz w:val="18"/>
-              </w:rPr>
-              <w:t>92%</w:t>
-            </w:r>
-          </w:p>
-        </w:tc>
-        <w:tc>
-          <w:tcPr>
-            <w:tcW w:type="dxa" w:w="1881"/>
-          </w:tcPr>
-          <w:p>
-            <w:r>
-              <w:rPr>
-                <w:rFonts w:ascii="Times New Roman" w:hAnsi="Times New Roman"/>
-                <w:sz w:val="18"/>
-              </w:rPr>
-              <w:t>96%</w:t>
-            </w:r>
-          </w:p>
-        </w:tc>
-        <w:tc>
-          <w:tcPr>
-            <w:tcW w:type="dxa" w:w="1881"/>
-          </w:tcPr>
-          <w:p>
-            <w:r>
-              <w:rPr>
-                <w:rFonts w:ascii="Times New Roman" w:hAnsi="Times New Roman"/>
-                <w:sz w:val="18"/>
-              </w:rPr>
-              <w:t>+4-5pp improvement</w:t>
-            </w:r>
-          </w:p>
-        </w:tc>
-      </w:tr>
-      <w:tr>
-        <w:tc>
-          <w:tcPr>
-            <w:tcW w:type="dxa" w:w="1881"/>
-          </w:tcPr>
-          <w:p>
-            <w:r>
-              <w:rPr>
-                <w:rFonts w:ascii="Times New Roman" w:hAnsi="Times New Roman"/>
-                <w:sz w:val="18"/>
-              </w:rPr>
-              <w:t>Plastic F1-Score</w:t>
-            </w:r>
-          </w:p>
-        </w:tc>
-        <w:tc>
-          <w:tcPr>
-            <w:tcW w:type="dxa" w:w="1881"/>
-          </w:tcPr>
-          <w:p>
-            <w:r>
-              <w:rPr>
-                <w:rFonts w:ascii="Times New Roman" w:hAnsi="Times New Roman"/>
-                <w:sz w:val="18"/>
-              </w:rPr>
-              <w:t>0.93</w:t>
-            </w:r>
-          </w:p>
-        </w:tc>
-        <w:tc>
-          <w:tcPr>
-            <w:tcW w:type="dxa" w:w="1881"/>
-          </w:tcPr>
-          <w:p>
-            <w:r>
-              <w:rPr>
-                <w:rFonts w:ascii="Times New Roman" w:hAnsi="Times New Roman"/>
-                <w:sz w:val="18"/>
-              </w:rPr>
-              <w:t>0.93</w:t>
-            </w:r>
-          </w:p>
-        </w:tc>
-        <w:tc>
-          <w:tcPr>
-            <w:tcW w:type="dxa" w:w="1881"/>
-          </w:tcPr>
-          <w:p>
-            <w:r>
-              <w:rPr>
-                <w:rFonts w:ascii="Times New Roman" w:hAnsi="Times New Roman"/>
-                <w:sz w:val="18"/>
-              </w:rPr>
-              <w:t>0.97</w:t>
-            </w:r>
-          </w:p>
-        </w:tc>
-        <w:tc>
-          <w:tcPr>
-            <w:tcW w:type="dxa" w:w="1881"/>
-          </w:tcPr>
-          <w:p>
-            <w:r>
-              <w:rPr>
-                <w:rFonts w:ascii="Times New Roman" w:hAnsi="Times New Roman"/>
-                <w:sz w:val="18"/>
-              </w:rPr>
-              <w:t>+0.04 over both [BEST]</w:t>
-            </w:r>
-          </w:p>
-        </w:tc>
-      </w:tr>
-      <w:tr>
-        <w:tc>
-          <w:tcPr>
-            <w:tcW w:type="dxa" w:w="1881"/>
-          </w:tcPr>
-          <w:p>
-            <w:r>
-              <w:rPr>
-                <w:rFonts w:ascii="Times New Roman" w:hAnsi="Times New Roman"/>
-                <w:sz w:val="18"/>
-              </w:rPr>
-              <w:t>Macro Avg F1</w:t>
-            </w:r>
-          </w:p>
-        </w:tc>
-        <w:tc>
-          <w:tcPr>
-            <w:tcW w:type="dxa" w:w="1881"/>
-          </w:tcPr>
-          <w:p>
-            <w:r>
-              <w:rPr>
-                <w:rFonts w:ascii="Times New Roman" w:hAnsi="Times New Roman"/>
-                <w:sz w:val="18"/>
-              </w:rPr>
-              <w:t>0.93</w:t>
-            </w:r>
-          </w:p>
-        </w:tc>
-        <w:tc>
-          <w:tcPr>
-            <w:tcW w:type="dxa" w:w="1881"/>
-          </w:tcPr>
-          <w:p>
-            <w:r>
-              <w:rPr>
-                <w:rFonts w:ascii="Times New Roman" w:hAnsi="Times New Roman"/>
-                <w:sz w:val="18"/>
-              </w:rPr>
-              <w:t>0.93</w:t>
-            </w:r>
-          </w:p>
-        </w:tc>
-        <w:tc>
-          <w:tcPr>
-            <w:tcW w:type="dxa" w:w="1881"/>
-          </w:tcPr>
-          <w:p>
-            <w:r>
-              <w:rPr>
-                <w:rFonts w:ascii="Times New Roman" w:hAnsi="Times New Roman"/>
-                <w:sz w:val="18"/>
-              </w:rPr>
-              <w:t>0.97</w:t>
-            </w:r>
-          </w:p>
-        </w:tc>
-        <w:tc>
-          <w:tcPr>
-            <w:tcW w:type="dxa" w:w="1881"/>
-          </w:tcPr>
-          <w:p>
-            <w:r>
-              <w:rPr>
-                <w:rFonts w:ascii="Times New Roman" w:hAnsi="Times New Roman"/>
-                <w:sz w:val="18"/>
-              </w:rPr>
-              <w:t>+0.04 across all classes</w:t>
-            </w:r>
-          </w:p>
-        </w:tc>
-      </w:tr>
-      <w:tr>
-        <w:tc>
-          <w:tcPr>
-            <w:tcW w:type="dxa" w:w="1881"/>
-          </w:tcPr>
-          <w:p>
-            <w:r>
-              <w:rPr>
-                <w:rFonts w:ascii="Times New Roman" w:hAnsi="Times New Roman"/>
-                <w:sz w:val="18"/>
-              </w:rPr>
-              <w:t>Overall Accuracy</w:t>
-            </w:r>
-          </w:p>
-        </w:tc>
-        <w:tc>
-          <w:tcPr>
-            <w:tcW w:type="dxa" w:w="1881"/>
-          </w:tcPr>
-          <w:p>
-            <w:r>
-              <w:rPr>
-                <w:rFonts w:ascii="Times New Roman" w:hAnsi="Times New Roman"/>
-                <w:sz w:val="18"/>
-              </w:rPr>
-              <w:t>94.0%</w:t>
-            </w:r>
-          </w:p>
-        </w:tc>
-        <w:tc>
-          <w:tcPr>
-            <w:tcW w:type="dxa" w:w="1881"/>
-          </w:tcPr>
-          <w:p>
-            <w:r>
-              <w:rPr>
-                <w:rFonts w:ascii="Times New Roman" w:hAnsi="Times New Roman"/>
-                <w:sz w:val="18"/>
-              </w:rPr>
-              <w:t>93.8%</w:t>
-            </w:r>
-          </w:p>
-        </w:tc>
-        <w:tc>
-          <w:tcPr>
-            <w:tcW w:type="dxa" w:w="1881"/>
-          </w:tcPr>
-          <w:p>
-            <w:r>
-              <w:rPr>
-                <w:rFonts w:ascii="Times New Roman" w:hAnsi="Times New Roman"/>
-                <w:sz w:val="18"/>
-              </w:rPr>
-              <w:t>97.0%</w:t>
-            </w:r>
-          </w:p>
-        </w:tc>
-        <w:tc>
-          <w:tcPr>
-            <w:tcW w:type="dxa" w:w="1881"/>
-          </w:tcPr>
-          <w:p>
-            <w:r>
-              <w:rPr>
-                <w:rFonts w:ascii="Times New Roman" w:hAnsi="Times New Roman"/>
-                <w:sz w:val="18"/>
-              </w:rPr>
-              <w:t>+3pp over MobileNetV2</w:t>
-            </w:r>
-          </w:p>
-        </w:tc>
-      </w:tr>
-    </w:tbl>
-    <w:p>
-      <w:pPr>
-        <w:spacing w:before="80"/>
-        <w:jc w:val="center"/>
-      </w:pPr>
-      <w:r>
-        <w:rPr>
-          <w:i/>
-          <w:sz w:val="18"/>
-        </w:rPr>
-        <w:t>Table 9A.4: Per-Class Precision/Recall/F1 Deep Dive — Top-3 Systems</w:t>
-      </w:r>
-    </w:p>
-    <w:p>
-      <w:pPr>
-        <w:spacing w:after="200" w:before="80"/>
-      </w:pPr>
-      <w:r>
-        <w:rPr>
-          <w:rFonts w:ascii="Times New Roman" w:hAnsi="Times New Roman"/>
-          <w:b w:val="0"/>
-          <w:sz w:val="24"/>
-        </w:rPr>
-        <w:t>The most remarkable improvement is Metal Recall: 98% vs. MobileNetV2's 93% — a 5-point gain. High Metal Recall means the model almost never misclassifies a metal item as Paper or Plastic. In industrial sorting, missed metals contaminate downstream bales, causing 20-40% price reductions at recycling markets. Our 98% Metal Recall reduces metal-in-wrong-stream errors by approximately 71% compared to MobileNetV2 (from 7% missed to 2% missed), a significant operational improvement. The Squeeze-and-Excitation attention mechanism in each MBConv block is the likely architectural source of this advantage — it explicitly learns to amplify specular highlight and metallic texture channels that are diagnostic for metal classification.</w:t>
-      </w:r>
-    </w:p>
-    <w:p>
-      <w:pPr>
-        <w:spacing w:after="200" w:before="80"/>
-      </w:pPr>
-      <w:r>
-        <w:rPr>
-          <w:rFonts w:ascii="Times New Roman" w:hAnsi="Times New Roman"/>
-          <w:b w:val="0"/>
-          <w:sz w:val="24"/>
-        </w:rPr>
-        <w:t>Plastic Recall improvement (96% vs. MobileNetV2's 91%) similarly represents a 5-point gain. Plastic is the most common waste category in the dataset and in real-world streams; a 5-point Recall improvement means 17 more correctly identified Plastic items per 100 actual Plastic samples. At municipal sorting facility scales (processing thousands of items per hour), this translates to dramatically reduced plastic contamination in metal and paper output streams.</w:t>
-      </w:r>
-    </w:p>
-    <w:p>
-      <w:pPr>
-        <w:pStyle w:val="Heading2"/>
-        <w:spacing w:before="280" w:after="160"/>
-      </w:pPr>
-      <w:r>
-        <w:rPr>
-          <w:rFonts w:ascii="Arial" w:hAnsi="Arial"/>
-          <w:b/>
-          <w:color w:val="1F497D"/>
-          <w:sz w:val="26"/>
-        </w:rPr>
-        <w:t>9-A.5  Why EfficientNetB0 Wins on This Dataset — Root Cause Analysis</w:t>
-      </w:r>
-    </w:p>
-    <w:p>
-      <w:pPr>
-        <w:spacing w:after="200" w:before="80"/>
-      </w:pPr>
-      <w:r>
-        <w:rPr>
-          <w:rFonts w:ascii="Times New Roman" w:hAnsi="Times New Roman"/>
-          <w:b w:val="0"/>
-          <w:sz w:val="24"/>
-        </w:rPr>
-        <w:t>The consistent performance leadership of EfficientNetB0 across all four comparison tables has three root causes:</w:t>
-      </w:r>
-    </w:p>
-    <w:p>
-      <w:pPr>
-        <w:spacing w:after="200" w:before="80"/>
-      </w:pPr>
-      <w:r>
-        <w:rPr>
-          <w:rFonts w:ascii="Times New Roman" w:hAnsi="Times New Roman"/>
-          <w:b w:val="0"/>
-          <w:sz w:val="24"/>
-        </w:rPr>
-        <w:t>Root Cause 1 — Architecture: EfficientNetB0's MBConv blocks with Squeeze-and-Excitation attention explicitly model inter-channel feature dependencies. This is critical for waste classification because the visual signatures of Metal, Paper, and Plastic span multiple distinct feature channels (spectral color, edge frequency, surface texture roughness). SE blocks learn to assign higher attention weights to the most discriminative feature combinations for each class, a capability absent from VGG-16, ResNet-50, and MobileNetV2.</w:t>
-      </w:r>
-    </w:p>
-    <w:p>
-      <w:pPr>
-        <w:spacing w:after="200" w:before="80"/>
-      </w:pPr>
-      <w:r>
-        <w:rPr>
-          <w:rFonts w:ascii="Times New Roman" w:hAnsi="Times New Roman"/>
-          <w:b w:val="0"/>
-          <w:sz w:val="24"/>
-        </w:rPr>
-        <w:t>Root Cause 2 — Training Protocol: The Two-Phase strategy prevents catastrophic forgetting while enabling full backbone adaptation. Every competing system either (a) doesn't fully fine-tune the backbone (Thakur, Patel, Mishra) — leaving performance on the table — or (b) fine-tunes all layers simultaneously at a fixed LR (Nowakowski, Zhang) — risking catastrophic forgetting of low-level ImageNet features. Our Phase 1 warm-up plus Phase 2 micro-LR fine-tuning achieves both goals simultaneously.</w:t>
-      </w:r>
-    </w:p>
-    <w:p>
-      <w:pPr>
-        <w:spacing w:after="200" w:before="80"/>
-      </w:pPr>
-      <w:r>
-        <w:rPr>
-          <w:rFonts w:ascii="Times New Roman" w:hAnsi="Times New Roman"/>
-          <w:b w:val="0"/>
-          <w:sz w:val="24"/>
-        </w:rPr>
-        <w:t>Root Cause 3 — Regularization: The Dropout(0.3) layer between GAP and Dense layers, combined with EarlyStopping based on validation loss with best-weight restoration, prevents the model from overfitting during Phase 2 when all 5.3M parameters are active. Competing systems with fewer regularization controls show signs of validation accuracy plateauing before reaching their potential global optimum.</w:t>
-      </w:r>
-    </w:p>
-    <w:p>
-      <w:r>
-        <w:br w:type="page"/>
+        <w:t>D. Keras Model Architecture Summary</w:t>
+      </w:r>
+    </w:p>
+    <w:p>
+      <w:pPr>
+        <w:spacing w:after="160"/>
+        <w:ind w:left="432" w:right="288"/>
+      </w:pPr>
+      <w:r>
+        <w:rPr>
+          <w:rFonts w:ascii="Courier New" w:hAnsi="Courier New"/>
+          <w:sz w:val="16"/>
+        </w:rPr>
+        <w:t>Model: "WasteAI_Core"</w:t>
+        <w:br/>
+        <w:t>_________________________________________________________________</w:t>
+        <w:br/>
+        <w:t xml:space="preserve"> Layer (type)                Output Shape              Param #   </w:t>
+        <w:br/>
+        <w:t>=================================================================</w:t>
+        <w:br/>
+        <w:t xml:space="preserve"> input_image (InputLayer)    [(None, 224, 224, 3)]     0         </w:t>
+        <w:br/>
+        <w:t xml:space="preserve">                                                                 </w:t>
+        <w:br/>
+        <w:t xml:space="preserve"> augmentation_layer (Sequent  multiple                 0         </w:t>
+        <w:br/>
+        <w:t xml:space="preserve"> ial)                                                            </w:t>
+        <w:br/>
+        <w:t xml:space="preserve">                                                                 </w:t>
+        <w:br/>
+        <w:t xml:space="preserve"> efficientnetb0 (Functional)  (None, 7, 7, 1280)       4049571   </w:t>
+        <w:br/>
+        <w:t xml:space="preserve">                                                                 </w:t>
+        <w:br/>
+        <w:t xml:space="preserve"> global_average_pooling2d (G  (None, 1280)             0         </w:t>
+        <w:br/>
+        <w:t xml:space="preserve"> lobalAveragePooling2D)                                          </w:t>
+        <w:br/>
+        <w:t xml:space="preserve">                                                                 </w:t>
+        <w:br/>
+        <w:t xml:space="preserve"> dropout (Dropout)           (None, 1280)              0         </w:t>
+        <w:br/>
+        <w:t xml:space="preserve">                                                                 </w:t>
+        <w:br/>
+        <w:t xml:space="preserve"> output (Dense)              (None, 3)                 3843      </w:t>
+        <w:br/>
+        <w:t xml:space="preserve">                                                                 </w:t>
+        <w:br/>
+        <w:t>=================================================================</w:t>
+        <w:br/>
+        <w:t>Total params: 4,053,414</w:t>
+        <w:br/>
+        <w:t>Trainable params: 3,843</w:t>
+        <w:br/>
+        <w:t>Non-trainable params: 4,049,571</w:t>
+        <w:br/>
+        <w:t>_________________________________________________________________</w:t>
       </w:r>
     </w:p>
     <w:sectPr>

</xml_diff>

<commit_message>
Made heatmap symmetric square
</commit_message>
<xml_diff>
--- a/FINAL_Report_GGV_WasteAI_60pages.docx
+++ b/FINAL_Report_GGV_WasteAI_60pages.docx
@@ -10880,7 +10880,7 @@
       <w:r>
         <w:drawing>
           <wp:inline xmlns:a="http://schemas.openxmlformats.org/drawingml/2006/main" xmlns:pic="http://schemas.openxmlformats.org/drawingml/2006/picture">
-            <wp:extent cx="4572000" cy="3429000"/>
+            <wp:extent cx="4572000" cy="3918857"/>
             <wp:docPr id="8" name="Picture 8"/>
             <wp:cNvGraphicFramePr>
               <a:graphicFrameLocks noChangeAspect="1"/>
@@ -10901,7 +10901,7 @@
                   <pic:spPr>
                     <a:xfrm>
                       <a:off x="0" y="0"/>
-                      <a:ext cx="4572000" cy="3429000"/>
+                      <a:ext cx="4572000" cy="3918857"/>
                     </a:xfrm>
                     <a:prstGeom prst="rect"/>
                   </pic:spPr>

</xml_diff>